<commit_message>
Refresh matching first-draft packages with simple teammate guide and honest progress
</commit_message>
<xml_diff>
--- a/Task3_First_Draft_2026-10-24/04_Team/Team_Guide.docx
+++ b/Task3_First_Draft_2026-10-24/04_Team/Team_Guide.docx
@@ -7,17 +7,12 @@
         <w:pStyle w:val="Title"/>
       </w:pPr>
       <w:r>
-        <w:t>Task 3 First Draft Team Guide</w:t>
+        <w:t>What your teammates need to do</w:t>
       </w:r>
     </w:p>
     <w:p>
       <w:r>
-        <w:t>GPU sharing for multi-tenant inference | Prepared 24 October 2026</w:t>
-      </w:r>
-    </w:p>
-    <w:p>
-      <w:r>
-        <w:t>Use the new 30-study package for all further checking. Keep the two older ZIPs as backups. We have assembled the report and supporting evidence, but we have not completed every full-text eligibility decision in the wider review. This guide explains what changed, where each file is, and exactly what to check before the Sunday 25 October submission.</w:t>
+        <w:t>Use CEP_Task3_Team_Package_2026-10-24.zip and CEP_Task3_LaTeX_Project_2026-10-24.zip. The older two ZIPs are backups. Both current packages describe the same 30 studies and 31 reports.</w:t>
       </w:r>
     </w:p>
     <w:p>
@@ -25,361 +20,27 @@
         <w:pStyle w:val="Heading1"/>
       </w:pPr>
       <w:r>
-        <w:t>What is complete and what is still open</w:t>
-      </w:r>
-    </w:p>
-    <w:tbl>
-      <w:tblPr>
-        <w:tblW w:type="auto" w:w="0"/>
-        <w:tblLayout w:type="fixed"/>
-        <w:tblLook w:firstColumn="1" w:firstRow="1" w:lastColumn="0" w:lastRow="0" w:noHBand="0" w:noVBand="1" w:val="04A0"/>
-        <w:tblBorders>
-          <w:top w:val="single" w:sz="4" w:color="D9D9D9"/>
-          <w:left w:val="single" w:sz="4" w:color="D9D9D9"/>
-          <w:bottom w:val="single" w:sz="4" w:color="D9D9D9"/>
-          <w:right w:val="single" w:sz="4" w:color="D9D9D9"/>
-          <w:insideH w:val="single" w:sz="4" w:color="D9D9D9"/>
-          <w:insideV w:val="single" w:sz="4" w:color="D9D9D9"/>
-        </w:tblBorders>
-      </w:tblPr>
-      <w:tblGrid>
-        <w:gridCol w:w="5040"/>
-        <w:gridCol w:w="5040"/>
-      </w:tblGrid>
-      <w:tr>
-        <w:trPr>
-          <w:tblHeader/>
-        </w:trPr>
-        <w:tc>
-          <w:tcPr>
-            <w:tcW w:type="dxa" w:w="2880"/>
-            <w:shd w:fill="E8EDF2"/>
-            <w:vAlign w:val="center"/>
-          </w:tcPr>
-          <w:p>
-            <w:pPr>
-              <w:spacing w:after="80"/>
-            </w:pPr>
-            <w:r>
-              <w:rPr>
-                <w:b/>
-                <w:sz w:val="20"/>
-              </w:rPr>
-              <w:t>Measure</w:t>
-            </w:r>
-          </w:p>
-        </w:tc>
-        <w:tc>
-          <w:tcPr>
-            <w:tcW w:type="dxa" w:w="7056"/>
-            <w:shd w:fill="E8EDF2"/>
-            <w:vAlign w:val="center"/>
-          </w:tcPr>
-          <w:p>
-            <w:pPr>
-              <w:spacing w:after="80"/>
-            </w:pPr>
-            <w:r>
-              <w:rPr>
-                <w:b/>
-                <w:sz w:val="20"/>
-              </w:rPr>
-              <w:t>Verified position</w:t>
-            </w:r>
-          </w:p>
-        </w:tc>
-      </w:tr>
-      <w:tr>
-        <w:tc>
-          <w:tcPr>
-            <w:tcW w:type="dxa" w:w="2880"/>
-            <w:vAlign w:val="center"/>
-          </w:tcPr>
-          <w:p>
-            <w:pPr>
-              <w:spacing w:after="80"/>
-            </w:pPr>
-            <w:r>
-              <w:rPr>
-                <w:b w:val="0"/>
-                <w:sz w:val="20"/>
-              </w:rPr>
-              <w:t>Older shared package</w:t>
-            </w:r>
-          </w:p>
-        </w:tc>
-        <w:tc>
-          <w:tcPr>
-            <w:tcW w:type="dxa" w:w="7056"/>
-            <w:vAlign w:val="center"/>
-          </w:tcPr>
-          <w:p>
-            <w:pPr>
-              <w:spacing w:after="80"/>
-            </w:pPr>
-            <w:r>
-              <w:rPr>
-                <w:b w:val="0"/>
-                <w:sz w:val="20"/>
-              </w:rPr>
-              <w:t>20 unique studies, 21 reports, 200 QA items and 52 outcome rows</w:t>
-            </w:r>
-          </w:p>
-        </w:tc>
-      </w:tr>
-      <w:tr>
-        <w:tc>
-          <w:tcPr>
-            <w:tcW w:type="dxa" w:w="2880"/>
-            <w:shd w:fill="F5F7F9"/>
-            <w:vAlign w:val="center"/>
-          </w:tcPr>
-          <w:p>
-            <w:pPr>
-              <w:spacing w:after="80"/>
-            </w:pPr>
-            <w:r>
-              <w:rPr>
-                <w:b w:val="0"/>
-                <w:sz w:val="20"/>
-              </w:rPr>
-              <w:t>Current assessed package</w:t>
-            </w:r>
-          </w:p>
-        </w:tc>
-        <w:tc>
-          <w:tcPr>
-            <w:tcW w:type="dxa" w:w="7056"/>
-            <w:shd w:fill="F5F7F9"/>
-            <w:vAlign w:val="center"/>
-          </w:tcPr>
-          <w:p>
-            <w:pPr>
-              <w:spacing w:after="80"/>
-            </w:pPr>
-            <w:r>
-              <w:rPr>
-                <w:b w:val="0"/>
-                <w:sz w:val="20"/>
-              </w:rPr>
-              <w:t>30 unique studies, 31 reports, 300 QA items and 90 outcome rows</w:t>
-            </w:r>
-          </w:p>
-        </w:tc>
-      </w:tr>
-      <w:tr>
-        <w:tc>
-          <w:tcPr>
-            <w:tcW w:type="dxa" w:w="2880"/>
-            <w:vAlign w:val="center"/>
-          </w:tcPr>
-          <w:p>
-            <w:pPr>
-              <w:spacing w:after="80"/>
-            </w:pPr>
-            <w:r>
-              <w:rPr>
-                <w:b w:val="0"/>
-                <w:sz w:val="20"/>
-              </w:rPr>
-              <w:t>New papers</w:t>
-            </w:r>
-          </w:p>
-        </w:tc>
-        <w:tc>
-          <w:tcPr>
-            <w:tcW w:type="dxa" w:w="7056"/>
-            <w:vAlign w:val="center"/>
-          </w:tcPr>
-          <w:p>
-            <w:pPr>
-              <w:spacing w:after="80"/>
-            </w:pPr>
-            <w:r>
-              <w:rPr>
-                <w:b w:val="0"/>
-                <w:sz w:val="20"/>
-              </w:rPr>
-              <w:t>10 additions; each has six eligibility checks, ten QA items, extraction and a reference entry</w:t>
-            </w:r>
-          </w:p>
-        </w:tc>
-      </w:tr>
-      <w:tr>
-        <w:tc>
-          <w:tcPr>
-            <w:tcW w:type="dxa" w:w="2880"/>
-            <w:shd w:fill="F5F7F9"/>
-            <w:vAlign w:val="center"/>
-          </w:tcPr>
-          <w:p>
-            <w:pPr>
-              <w:spacing w:after="80"/>
-            </w:pPr>
-            <w:r>
-              <w:rPr>
-                <w:b w:val="0"/>
-                <w:sz w:val="20"/>
-              </w:rPr>
-              <w:t>Source PDFs</w:t>
-            </w:r>
-          </w:p>
-        </w:tc>
-        <w:tc>
-          <w:tcPr>
-            <w:tcW w:type="dxa" w:w="7056"/>
-            <w:shd w:fill="F5F7F9"/>
-            <w:vAlign w:val="center"/>
-          </w:tcPr>
-          <w:p>
-            <w:pPr>
-              <w:spacing w:after="80"/>
-            </w:pPr>
-            <w:r>
-              <w:rPr>
-                <w:b w:val="0"/>
-                <w:sz w:val="20"/>
-              </w:rPr>
-              <w:t>All ten added PDFs recovered and matched to their assessment hashes</w:t>
-            </w:r>
-          </w:p>
-        </w:tc>
-      </w:tr>
-      <w:tr>
-        <w:tc>
-          <w:tcPr>
-            <w:tcW w:type="dxa" w:w="2880"/>
-            <w:vAlign w:val="center"/>
-          </w:tcPr>
-          <w:p>
-            <w:pPr>
-              <w:spacing w:after="80"/>
-            </w:pPr>
-            <w:r>
-              <w:rPr>
-                <w:b w:val="0"/>
-                <w:sz w:val="20"/>
-              </w:rPr>
-              <w:t>Continuation screening</w:t>
-            </w:r>
-          </w:p>
-        </w:tc>
-        <w:tc>
-          <w:tcPr>
-            <w:tcW w:type="dxa" w:w="7056"/>
-            <w:vAlign w:val="center"/>
-          </w:tcPr>
-          <w:p>
-            <w:pPr>
-              <w:spacing w:after="80"/>
-            </w:pPr>
-            <w:r>
-              <w:rPr>
-                <w:b w:val="0"/>
-                <w:sz w:val="20"/>
-              </w:rPr>
-              <w:t>559 of 559 decisions recorded: 225 excluded and 334 advanced</w:t>
-            </w:r>
-          </w:p>
-        </w:tc>
-      </w:tr>
-      <w:tr>
-        <w:tc>
-          <w:tcPr>
-            <w:tcW w:type="dxa" w:w="2880"/>
-            <w:shd w:fill="F5F7F9"/>
-            <w:vAlign w:val="center"/>
-          </w:tcPr>
-          <w:p>
-            <w:pPr>
-              <w:spacing w:after="80"/>
-            </w:pPr>
-            <w:r>
-              <w:rPr>
-                <w:b w:val="0"/>
-                <w:sz w:val="20"/>
-              </w:rPr>
-              <w:t>Continuation eligibility</w:t>
-            </w:r>
-          </w:p>
-        </w:tc>
-        <w:tc>
-          <w:tcPr>
-            <w:tcW w:type="dxa" w:w="7056"/>
-            <w:shd w:fill="F5F7F9"/>
-            <w:vAlign w:val="center"/>
-          </w:tcPr>
-          <w:p>
-            <w:pPr>
-              <w:spacing w:after="80"/>
-            </w:pPr>
-            <w:r>
-              <w:rPr>
-                <w:b w:val="0"/>
-                <w:sz w:val="20"/>
-              </w:rPr>
-              <w:t>14 of 334 advanced records closed: 10 included and four excluded; 320 deferred</w:t>
-            </w:r>
-          </w:p>
-        </w:tc>
-      </w:tr>
-      <w:tr>
-        <w:tc>
-          <w:tcPr>
-            <w:tcW w:type="dxa" w:w="2880"/>
-            <w:vAlign w:val="center"/>
-          </w:tcPr>
-          <w:p>
-            <w:pPr>
-              <w:spacing w:after="80"/>
-            </w:pPr>
-            <w:r>
-              <w:rPr>
-                <w:b w:val="0"/>
-                <w:sz w:val="20"/>
-              </w:rPr>
-              <w:t>Full SLR completion</w:t>
-            </w:r>
-          </w:p>
-        </w:tc>
-        <w:tc>
-          <w:tcPr>
-            <w:tcW w:type="dxa" w:w="7056"/>
-            <w:vAlign w:val="center"/>
-          </w:tcPr>
-          <w:p>
-            <w:pPr>
-              <w:spacing w:after="80"/>
-            </w:pPr>
-            <w:r>
-              <w:rPr>
-                <w:b w:val="0"/>
-                <w:sz w:val="20"/>
-              </w:rPr>
-              <w:t>Incomplete eligibility, historical search provenance and independent checking remain</w:t>
-            </w:r>
-          </w:p>
-        </w:tc>
-      </w:tr>
-    </w:tbl>
-    <w:p>
-      <w:r>
-        <w:t>The earlier 100% referred to assembling a bounded draft package. It did not mean that the entire SLR or every guideline requirement was fully closed. There is no defensible single percentage for all research work because the remaining records differ in effort and evidence availability.</w:t>
+        <w:t>Eshaal edits LaTeX</w:t>
       </w:r>
     </w:p>
     <w:p>
       <w:r>
-        <w:t>A record is a database entry. A report is a paper version. A study is the underlying investigation. The two linked REEF reports count as one study, which is why 31 reports represent 30 studies.</w:t>
+        <w:t>1. Upload the LaTeX ZIP to Overleaf. Set main.tex as the main document and use pdfLaTeX.</w:t>
       </w:r>
     </w:p>
     <w:p>
       <w:r>
-        <w:t>Screening-stage completion does not mean that every abstract was available. The report identifies title or metadata-only decisions and 163 records without recovered abstract text. Evidence levels remain explicit in the screening log.</w:t>
+        <w:t>2. Read the report from Introduction to Conclusion. Improve clear wording, headings, table wrapping and spelling. Keep references and evidence appendices.</w:t>
       </w:r>
     </w:p>
     <w:p>
       <w:r>
-        <w:br w:type="page"/>
+        <w:t>3. Keep claims, numbers, paper IDs and the stated research limitations consistent with the master workbook. Ask Rameen to verify any factual change.</w:t>
+      </w:r>
+    </w:p>
+    <w:p>
+      <w:r>
+        <w:t>4. Recompile. Return the edited project ZIP and matching PDF as one version.</w:t>
       </w:r>
     </w:p>
     <w:p>
@@ -387,386 +48,27 @@
         <w:pStyle w:val="Heading1"/>
       </w:pPr>
       <w:r>
-        <w:t>Which files to use now</w:t>
+        <w:t>Rameen checks evidence</w:t>
       </w:r>
     </w:p>
-    <w:tbl>
-      <w:tblPr>
-        <w:tblW w:type="auto" w:w="0"/>
-        <w:tblLayout w:type="fixed"/>
-        <w:tblLook w:firstColumn="1" w:firstRow="1" w:lastColumn="0" w:lastRow="0" w:noHBand="0" w:noVBand="1" w:val="04A0"/>
-        <w:tblBorders>
-          <w:top w:val="single" w:sz="4" w:color="D9D9D9"/>
-          <w:left w:val="single" w:sz="4" w:color="D9D9D9"/>
-          <w:bottom w:val="single" w:sz="4" w:color="D9D9D9"/>
-          <w:right w:val="single" w:sz="4" w:color="D9D9D9"/>
-          <w:insideH w:val="single" w:sz="4" w:color="D9D9D9"/>
-          <w:insideV w:val="single" w:sz="4" w:color="D9D9D9"/>
-        </w:tblBorders>
-      </w:tblPr>
-      <w:tblGrid>
-        <w:gridCol w:w="5040"/>
-        <w:gridCol w:w="5040"/>
-      </w:tblGrid>
-      <w:tr>
-        <w:trPr>
-          <w:tblHeader/>
-        </w:trPr>
-        <w:tc>
-          <w:tcPr>
-            <w:tcW w:type="dxa" w:w="3600"/>
-            <w:shd w:fill="E8EDF2"/>
-            <w:vAlign w:val="center"/>
-          </w:tcPr>
-          <w:p>
-            <w:pPr>
-              <w:spacing w:after="80"/>
-            </w:pPr>
-            <w:r>
-              <w:rPr>
-                <w:b/>
-                <w:sz w:val="20"/>
-              </w:rPr>
-              <w:t>File or folder</w:t>
-            </w:r>
-          </w:p>
-        </w:tc>
-        <w:tc>
-          <w:tcPr>
-            <w:tcW w:type="dxa" w:w="6336"/>
-            <w:shd w:fill="E8EDF2"/>
-            <w:vAlign w:val="center"/>
-          </w:tcPr>
-          <w:p>
-            <w:pPr>
-              <w:spacing w:after="80"/>
-            </w:pPr>
-            <w:r>
-              <w:rPr>
-                <w:b/>
-                <w:sz w:val="20"/>
-              </w:rPr>
-              <w:t>Use</w:t>
-            </w:r>
-          </w:p>
-        </w:tc>
-      </w:tr>
-      <w:tr>
-        <w:tc>
-          <w:tcPr>
-            <w:tcW w:type="dxa" w:w="3600"/>
-            <w:vAlign w:val="center"/>
-          </w:tcPr>
-          <w:p>
-            <w:pPr>
-              <w:spacing w:after="80"/>
-            </w:pPr>
-            <w:r>
-              <w:rPr>
-                <w:b w:val="0"/>
-                <w:sz w:val="20"/>
-              </w:rPr>
-              <w:t>01_Report/CEP_Task3_First_Draft.pdf</w:t>
-            </w:r>
-          </w:p>
-        </w:tc>
-        <w:tc>
-          <w:tcPr>
-            <w:tcW w:type="dxa" w:w="6336"/>
-            <w:vAlign w:val="center"/>
-          </w:tcPr>
-          <w:p>
-            <w:pPr>
-              <w:spacing w:after="80"/>
-            </w:pPr>
-            <w:r>
-              <w:rPr>
-                <w:b w:val="0"/>
-                <w:sz w:val="20"/>
-              </w:rPr>
-              <w:t>Read the current typeset report. Use its printed sections and study IDs for comments.</w:t>
-            </w:r>
-          </w:p>
-        </w:tc>
-      </w:tr>
-      <w:tr>
-        <w:tc>
-          <w:tcPr>
-            <w:tcW w:type="dxa" w:w="3600"/>
-            <w:shd w:fill="F5F7F9"/>
-            <w:vAlign w:val="center"/>
-          </w:tcPr>
-          <w:p>
-            <w:pPr>
-              <w:spacing w:after="80"/>
-            </w:pPr>
-            <w:r>
-              <w:rPr>
-                <w:b w:val="0"/>
-                <w:sz w:val="20"/>
-              </w:rPr>
-              <w:t>01_Report/CEP_Task3_First_Draft.docx</w:t>
-            </w:r>
-          </w:p>
-        </w:tc>
-        <w:tc>
-          <w:tcPr>
-            <w:tcW w:type="dxa" w:w="6336"/>
-            <w:shd w:fill="F5F7F9"/>
-            <w:vAlign w:val="center"/>
-          </w:tcPr>
-          <w:p>
-            <w:pPr>
-              <w:spacing w:after="80"/>
-            </w:pPr>
-            <w:r>
-              <w:rPr>
-                <w:b w:val="0"/>
-                <w:sz w:val="20"/>
-              </w:rPr>
-              <w:t>Leave review comments or tracked edits. Word edits do not automatically update LaTeX.</w:t>
-            </w:r>
-          </w:p>
-        </w:tc>
-      </w:tr>
-      <w:tr>
-        <w:tc>
-          <w:tcPr>
-            <w:tcW w:type="dxa" w:w="3600"/>
-            <w:vAlign w:val="center"/>
-          </w:tcPr>
-          <w:p>
-            <w:pPr>
-              <w:spacing w:after="80"/>
-            </w:pPr>
-            <w:r>
-              <w:rPr>
-                <w:b w:val="0"/>
-                <w:sz w:val="20"/>
-              </w:rPr>
-              <w:t>02_Master/CEP_Task3_Evidence_Workbook.xlsx</w:t>
-            </w:r>
-          </w:p>
-        </w:tc>
-        <w:tc>
-          <w:tcPr>
-            <w:tcW w:type="dxa" w:w="6336"/>
-            <w:vAlign w:val="center"/>
-          </w:tcPr>
-          <w:p>
-            <w:pPr>
-              <w:spacing w:after="80"/>
-            </w:pPr>
-            <w:r>
-              <w:rPr>
-                <w:b w:val="0"/>
-                <w:sz w:val="20"/>
-              </w:rPr>
-              <w:t>Use this database as the current master. The older database is a historical backup.</w:t>
-            </w:r>
-          </w:p>
-        </w:tc>
-      </w:tr>
-      <w:tr>
-        <w:tc>
-          <w:tcPr>
-            <w:tcW w:type="dxa" w:w="3600"/>
-            <w:shd w:fill="F5F7F9"/>
-            <w:vAlign w:val="center"/>
-          </w:tcPr>
-          <w:p>
-            <w:pPr>
-              <w:spacing w:after="80"/>
-            </w:pPr>
-            <w:r>
-              <w:rPr>
-                <w:b w:val="0"/>
-                <w:sz w:val="20"/>
-              </w:rPr>
-              <w:t>03_Data_and_Logs</w:t>
-            </w:r>
-          </w:p>
-        </w:tc>
-        <w:tc>
-          <w:tcPr>
-            <w:tcW w:type="dxa" w:w="6336"/>
-            <w:shd w:fill="F5F7F9"/>
-            <w:vAlign w:val="center"/>
-          </w:tcPr>
-          <w:p>
-            <w:pPr>
-              <w:spacing w:after="80"/>
-            </w:pPr>
-            <w:r>
-              <w:rPr>
-                <w:b w:val="0"/>
-                <w:sz w:val="20"/>
-              </w:rPr>
-              <w:t>CSV copies of the main tables, screening decisions, criteria, QA, references and remaining queue.</w:t>
-            </w:r>
-          </w:p>
-        </w:tc>
-      </w:tr>
-      <w:tr>
-        <w:tc>
-          <w:tcPr>
-            <w:tcW w:type="dxa" w:w="3600"/>
-            <w:vAlign w:val="center"/>
-          </w:tcPr>
-          <w:p>
-            <w:pPr>
-              <w:spacing w:after="80"/>
-            </w:pPr>
-            <w:r>
-              <w:rPr>
-                <w:b w:val="0"/>
-                <w:sz w:val="20"/>
-              </w:rPr>
-              <w:t>04_Team</w:t>
-            </w:r>
-          </w:p>
-        </w:tc>
-        <w:tc>
-          <w:tcPr>
-            <w:tcW w:type="dxa" w:w="6336"/>
-            <w:vAlign w:val="center"/>
-          </w:tcPr>
-          <w:p>
-            <w:pPr>
-              <w:spacing w:after="80"/>
-            </w:pPr>
-            <w:r>
-              <w:rPr>
-                <w:b w:val="0"/>
-                <w:sz w:val="20"/>
-              </w:rPr>
-              <w:t>This guide, paper map, deliverable checklist, individual check queues and correction inbox.</w:t>
-            </w:r>
-          </w:p>
-        </w:tc>
-      </w:tr>
-      <w:tr>
-        <w:tc>
-          <w:tcPr>
-            <w:tcW w:type="dxa" w:w="3600"/>
-            <w:shd w:fill="F5F7F9"/>
-            <w:vAlign w:val="center"/>
-          </w:tcPr>
-          <w:p>
-            <w:pPr>
-              <w:spacing w:after="80"/>
-            </w:pPr>
-            <w:r>
-              <w:rPr>
-                <w:b w:val="0"/>
-                <w:sz w:val="20"/>
-              </w:rPr>
-              <w:t>05_Added_Paper_PDFs</w:t>
-            </w:r>
-          </w:p>
-        </w:tc>
-        <w:tc>
-          <w:tcPr>
-            <w:tcW w:type="dxa" w:w="6336"/>
-            <w:shd w:fill="F5F7F9"/>
-            <w:vAlign w:val="center"/>
-          </w:tcPr>
-          <w:p>
-            <w:pPr>
-              <w:spacing w:after="80"/>
-            </w:pPr>
-            <w:r>
-              <w:rPr>
-                <w:b w:val="0"/>
-                <w:sz w:val="20"/>
-              </w:rPr>
-              <w:t>Ten source PDFs in the private team ZIP. Public GitHub contains source links and hashes instead.</w:t>
-            </w:r>
-          </w:p>
-        </w:tc>
-      </w:tr>
-      <w:tr>
-        <w:tc>
-          <w:tcPr>
-            <w:tcW w:type="dxa" w:w="3600"/>
-            <w:vAlign w:val="center"/>
-          </w:tcPr>
-          <w:p>
-            <w:pPr>
-              <w:spacing w:after="80"/>
-            </w:pPr>
-            <w:r>
-              <w:rPr>
-                <w:b w:val="0"/>
-                <w:sz w:val="20"/>
-              </w:rPr>
-              <w:t>06_Protocol_and_Guidelines</w:t>
-            </w:r>
-          </w:p>
-        </w:tc>
-        <w:tc>
-          <w:tcPr>
-            <w:tcW w:type="dxa" w:w="6336"/>
-            <w:vAlign w:val="center"/>
-          </w:tcPr>
-          <w:p>
-            <w:pPr>
-              <w:spacing w:after="80"/>
-            </w:pPr>
-            <w:r>
-              <w:rPr>
-                <w:b w:val="0"/>
-                <w:sz w:val="20"/>
-              </w:rPr>
-              <w:t>Original submitted protocol and the exact guideline PDF shared in this chat.</w:t>
-            </w:r>
-          </w:p>
-        </w:tc>
-      </w:tr>
-      <w:tr>
-        <w:tc>
-          <w:tcPr>
-            <w:tcW w:type="dxa" w:w="3600"/>
-            <w:shd w:fill="F5F7F9"/>
-            <w:vAlign w:val="center"/>
-          </w:tcPr>
-          <w:p>
-            <w:pPr>
-              <w:spacing w:after="80"/>
-            </w:pPr>
-            <w:r>
-              <w:rPr>
-                <w:b w:val="0"/>
-                <w:sz w:val="20"/>
-              </w:rPr>
-              <w:t>Task3_LaTeX_2026-10-24</w:t>
-            </w:r>
-          </w:p>
-        </w:tc>
-        <w:tc>
-          <w:tcPr>
-            <w:tcW w:type="dxa" w:w="6336"/>
-            <w:shd w:fill="F5F7F9"/>
-            <w:vAlign w:val="center"/>
-          </w:tcPr>
-          <w:p>
-            <w:pPr>
-              <w:spacing w:after="80"/>
-            </w:pPr>
-            <w:r>
-              <w:rPr>
-                <w:b w:val="0"/>
-                <w:sz w:val="20"/>
-              </w:rPr>
-              <w:t>Separate runnable LaTeX project. Upload its ZIP to Overleaf or use the build commands in its README.</w:t>
-            </w:r>
-          </w:p>
-        </w:tc>
-      </w:tr>
-    </w:tbl>
     <w:p>
       <w:r>
-        <w:t>The new folders supersede the two older ZIPs for editing. Previous checks are still useful: copy a correction by study/report ID into the current correction inbox. Do not silently replace the new master with an older workbook.</w:t>
+        <w:t>1. Open 01_Report/CEP_Task3_First_Draft.pdf and 02_Master/CEP_Task3_Evidence_Workbook.xlsx from the team package.</w:t>
+      </w:r>
+    </w:p>
+    <w:p>
+      <w:r>
+        <w:t>2. Use 04_Team/New_Paper_Map.csv to locate the ten added papers and their PDFs in 05_Added_Paper_PDFs. Check that each cited result has the same metric, value, workload and source page as the workbook. Read the QA and eligibility evidence for those papers.</w:t>
+      </w:r>
+    </w:p>
+    <w:p>
+      <w:r>
+        <w:t>3. Check the report counts: 30 studies, 31 reports, 300 QA items, 90 reported observations, two separate calculations; continuation eligibility 16/334 closed and 318 open. Confirm citations appear in the reference list. Reuse verified DOIs; investigate a DOI only if a mismatch appears.</w:t>
+      </w:r>
+    </w:p>
+    <w:p>
+      <w:r>
+        <w:t>4. Send Eshaal a short corrections list: paper ID, report location, source page, old wording/number and corrected wording/number. Record your name/date only for checks actually completed.</w:t>
       </w:r>
     </w:p>
     <w:p>
@@ -774,42 +76,12 @@
         <w:pStyle w:val="Heading1"/>
       </w:pPr>
       <w:r>
-        <w:t>How to open and start</w:t>
+        <w:t>Finish together</w:t>
       </w:r>
     </w:p>
     <w:p>
       <w:r>
-        <w:t>1. Download and extract the new team ZIP. Keep its folders together.</w:t>
-      </w:r>
-    </w:p>
-    <w:p>
-      <w:r>
-        <w:t>2. Open this guide, then open the report PDF and the master workbook.</w:t>
-      </w:r>
-    </w:p>
-    <w:p>
-      <w:r>
-        <w:t>3. In Excel, open Studies. Search your study ID, for example S028. Read its report ID, DOI and QA denominator.</w:t>
-      </w:r>
-    </w:p>
-    <w:p>
-      <w:r>
-        <w:t>4. Open the matching source PDF from 05_Added_Paper_PDFs using the paper map.</w:t>
-      </w:r>
-    </w:p>
-    <w:p>
-      <w:r>
-        <w:t>5. Open your Eshaal_Checks.csv or Rameen_Checks.csv. These are blank check records; they are not claims that you already verified anything.</w:t>
-      </w:r>
-    </w:p>
-    <w:p>
-      <w:r>
-        <w:t>6. Read the source anchor, compare it with the recorded claim and enter an actual finding. Return the completed CSV and any Word comments to Raazia.</w:t>
-      </w:r>
-    </w:p>
-    <w:p>
-      <w:r>
-        <w:br w:type="page"/>
+        <w:t>Rameen checks Eshaal's rebuilt PDF against the corrections list. Both confirm the cover details, references, tables and all 13 report sections. Eshaal returns one final PDF and one matching LaTeX ZIP; retain the matching Word/master/logs in the team package. No additional screening task is assigned to Raazia by this guide.</w:t>
       </w:r>
     </w:p>
     <w:p>
@@ -817,3123 +89,22 @@
         <w:pStyle w:val="Heading1"/>
       </w:pPr>
       <w:r>
-        <w:t>The ten papers added after the frozen version</w:t>
-      </w:r>
-    </w:p>
-    <w:tbl>
-      <w:tblPr>
-        <w:tblW w:type="auto" w:w="0"/>
-        <w:tblLayout w:type="fixed"/>
-        <w:tblLook w:firstColumn="1" w:firstRow="1" w:lastColumn="0" w:lastRow="0" w:noHBand="0" w:noVBand="1" w:val="04A0"/>
-        <w:tblBorders>
-          <w:top w:val="single" w:sz="4" w:color="D9D9D9"/>
-          <w:left w:val="single" w:sz="4" w:color="D9D9D9"/>
-          <w:bottom w:val="single" w:sz="4" w:color="D9D9D9"/>
-          <w:right w:val="single" w:sz="4" w:color="D9D9D9"/>
-          <w:insideH w:val="single" w:sz="4" w:color="D9D9D9"/>
-          <w:insideV w:val="single" w:sz="4" w:color="D9D9D9"/>
-        </w:tblBorders>
-      </w:tblPr>
-      <w:tblGrid>
-        <w:gridCol w:w="2520"/>
-        <w:gridCol w:w="2520"/>
-        <w:gridCol w:w="2520"/>
-        <w:gridCol w:w="2520"/>
-      </w:tblGrid>
-      <w:tr>
-        <w:trPr>
-          <w:tblHeader/>
-        </w:trPr>
-        <w:tc>
-          <w:tcPr>
-            <w:tcW w:type="dxa" w:w="2016"/>
-            <w:shd w:fill="E8EDF2"/>
-            <w:vAlign w:val="center"/>
-          </w:tcPr>
-          <w:p>
-            <w:pPr>
-              <w:spacing w:after="80"/>
-            </w:pPr>
-            <w:r>
-              <w:rPr>
-                <w:b/>
-                <w:sz w:val="20"/>
-              </w:rPr>
-              <w:t>Study and report</w:t>
-            </w:r>
-          </w:p>
-        </w:tc>
-        <w:tc>
-          <w:tcPr>
-            <w:tcW w:type="dxa" w:w="4752"/>
-            <w:shd w:fill="E8EDF2"/>
-            <w:vAlign w:val="center"/>
-          </w:tcPr>
-          <w:p>
-            <w:pPr>
-              <w:spacing w:after="80"/>
-            </w:pPr>
-            <w:r>
-              <w:rPr>
-                <w:b/>
-                <w:sz w:val="20"/>
-              </w:rPr>
-              <w:t>Paper</w:t>
-            </w:r>
-          </w:p>
-        </w:tc>
-        <w:tc>
-          <w:tcPr>
-            <w:tcW w:type="dxa" w:w="1728"/>
-            <w:shd w:fill="E8EDF2"/>
-            <w:vAlign w:val="center"/>
-          </w:tcPr>
-          <w:p>
-            <w:pPr>
-              <w:spacing w:after="80"/>
-            </w:pPr>
-            <w:r>
-              <w:rPr>
-                <w:b/>
-                <w:sz w:val="20"/>
-              </w:rPr>
-              <w:t>Checker</w:t>
-            </w:r>
-          </w:p>
-        </w:tc>
-        <w:tc>
-          <w:tcPr>
-            <w:tcW w:type="dxa" w:w="1440"/>
-            <w:shd w:fill="E8EDF2"/>
-            <w:vAlign w:val="center"/>
-          </w:tcPr>
-          <w:p>
-            <w:pPr>
-              <w:spacing w:after="80"/>
-            </w:pPr>
-            <w:r>
-              <w:rPr>
-                <w:b/>
-                <w:sz w:val="20"/>
-              </w:rPr>
-              <w:t>Outcomes</w:t>
-            </w:r>
-          </w:p>
-        </w:tc>
-      </w:tr>
-      <w:tr>
-        <w:tc>
-          <w:tcPr>
-            <w:tcW w:type="dxa" w:w="2016"/>
-            <w:vAlign w:val="center"/>
-          </w:tcPr>
-          <w:p>
-            <w:pPr>
-              <w:spacing w:after="80"/>
-            </w:pPr>
-            <w:r>
-              <w:rPr>
-                <w:b w:val="0"/>
-                <w:sz w:val="20"/>
-              </w:rPr>
-              <w:t>S021 / P024</w:t>
-            </w:r>
-          </w:p>
-        </w:tc>
-        <w:tc>
-          <w:tcPr>
-            <w:tcW w:type="dxa" w:w="4752"/>
-            <w:vAlign w:val="center"/>
-          </w:tcPr>
-          <w:p>
-            <w:pPr>
-              <w:spacing w:after="80"/>
-            </w:pPr>
-            <w:r>
-              <w:rPr>
-                <w:b w:val="0"/>
-                <w:sz w:val="20"/>
-              </w:rPr>
-              <w:t>LithOS</w:t>
-            </w:r>
-          </w:p>
-        </w:tc>
-        <w:tc>
-          <w:tcPr>
-            <w:tcW w:type="dxa" w:w="1728"/>
-            <w:vAlign w:val="center"/>
-          </w:tcPr>
-          <w:p>
-            <w:pPr>
-              <w:spacing w:after="80"/>
-            </w:pPr>
-            <w:r>
-              <w:rPr>
-                <w:b w:val="0"/>
-                <w:sz w:val="20"/>
-              </w:rPr>
-              <w:t>Eshaal</w:t>
-            </w:r>
-          </w:p>
-        </w:tc>
-        <w:tc>
-          <w:tcPr>
-            <w:tcW w:type="dxa" w:w="1440"/>
-            <w:vAlign w:val="center"/>
-          </w:tcPr>
-          <w:p>
-            <w:pPr>
-              <w:spacing w:after="80"/>
-            </w:pPr>
-            <w:r>
-              <w:rPr>
-                <w:b w:val="0"/>
-                <w:sz w:val="20"/>
-              </w:rPr>
-              <w:t>2</w:t>
-            </w:r>
-          </w:p>
-        </w:tc>
-      </w:tr>
-      <w:tr>
-        <w:tc>
-          <w:tcPr>
-            <w:tcW w:type="dxa" w:w="2016"/>
-            <w:shd w:fill="F5F7F9"/>
-            <w:vAlign w:val="center"/>
-          </w:tcPr>
-          <w:p>
-            <w:pPr>
-              <w:spacing w:after="80"/>
-            </w:pPr>
-            <w:r>
-              <w:rPr>
-                <w:b w:val="0"/>
-                <w:sz w:val="20"/>
-              </w:rPr>
-              <w:t>S022 / P025</w:t>
-            </w:r>
-          </w:p>
-        </w:tc>
-        <w:tc>
-          <w:tcPr>
-            <w:tcW w:type="dxa" w:w="4752"/>
-            <w:shd w:fill="F5F7F9"/>
-            <w:vAlign w:val="center"/>
-          </w:tcPr>
-          <w:p>
-            <w:pPr>
-              <w:spacing w:after="80"/>
-            </w:pPr>
-            <w:r>
-              <w:rPr>
-                <w:b w:val="0"/>
-                <w:sz w:val="20"/>
-              </w:rPr>
-              <w:t>Abacus</w:t>
-            </w:r>
-          </w:p>
-        </w:tc>
-        <w:tc>
-          <w:tcPr>
-            <w:tcW w:type="dxa" w:w="1728"/>
-            <w:shd w:fill="F5F7F9"/>
-            <w:vAlign w:val="center"/>
-          </w:tcPr>
-          <w:p>
-            <w:pPr>
-              <w:spacing w:after="80"/>
-            </w:pPr>
-            <w:r>
-              <w:rPr>
-                <w:b w:val="0"/>
-                <w:sz w:val="20"/>
-              </w:rPr>
-              <w:t>Rameen</w:t>
-            </w:r>
-          </w:p>
-        </w:tc>
-        <w:tc>
-          <w:tcPr>
-            <w:tcW w:type="dxa" w:w="1440"/>
-            <w:shd w:fill="F5F7F9"/>
-            <w:vAlign w:val="center"/>
-          </w:tcPr>
-          <w:p>
-            <w:pPr>
-              <w:spacing w:after="80"/>
-            </w:pPr>
-            <w:r>
-              <w:rPr>
-                <w:b w:val="0"/>
-                <w:sz w:val="20"/>
-              </w:rPr>
-              <w:t>2</w:t>
-            </w:r>
-          </w:p>
-        </w:tc>
-      </w:tr>
-      <w:tr>
-        <w:tc>
-          <w:tcPr>
-            <w:tcW w:type="dxa" w:w="2016"/>
-            <w:vAlign w:val="center"/>
-          </w:tcPr>
-          <w:p>
-            <w:pPr>
-              <w:spacing w:after="80"/>
-            </w:pPr>
-            <w:r>
-              <w:rPr>
-                <w:b w:val="0"/>
-                <w:sz w:val="20"/>
-              </w:rPr>
-              <w:t>S023 / P026</w:t>
-            </w:r>
-          </w:p>
-        </w:tc>
-        <w:tc>
-          <w:tcPr>
-            <w:tcW w:type="dxa" w:w="4752"/>
-            <w:vAlign w:val="center"/>
-          </w:tcPr>
-          <w:p>
-            <w:pPr>
-              <w:spacing w:after="80"/>
-            </w:pPr>
-            <w:r>
-              <w:rPr>
-                <w:b w:val="0"/>
-                <w:sz w:val="20"/>
-              </w:rPr>
-              <w:t>Miriam</w:t>
-            </w:r>
-          </w:p>
-        </w:tc>
-        <w:tc>
-          <w:tcPr>
-            <w:tcW w:type="dxa" w:w="1728"/>
-            <w:vAlign w:val="center"/>
-          </w:tcPr>
-          <w:p>
-            <w:pPr>
-              <w:spacing w:after="80"/>
-            </w:pPr>
-            <w:r>
-              <w:rPr>
-                <w:b w:val="0"/>
-                <w:sz w:val="20"/>
-              </w:rPr>
-              <w:t>Eshaal</w:t>
-            </w:r>
-          </w:p>
-        </w:tc>
-        <w:tc>
-          <w:tcPr>
-            <w:tcW w:type="dxa" w:w="1440"/>
-            <w:vAlign w:val="center"/>
-          </w:tcPr>
-          <w:p>
-            <w:pPr>
-              <w:spacing w:after="80"/>
-            </w:pPr>
-            <w:r>
-              <w:rPr>
-                <w:b w:val="0"/>
-                <w:sz w:val="20"/>
-              </w:rPr>
-              <w:t>2</w:t>
-            </w:r>
-          </w:p>
-        </w:tc>
-      </w:tr>
-      <w:tr>
-        <w:tc>
-          <w:tcPr>
-            <w:tcW w:type="dxa" w:w="2016"/>
-            <w:shd w:fill="F5F7F9"/>
-            <w:vAlign w:val="center"/>
-          </w:tcPr>
-          <w:p>
-            <w:pPr>
-              <w:spacing w:after="80"/>
-            </w:pPr>
-            <w:r>
-              <w:rPr>
-                <w:b w:val="0"/>
-                <w:sz w:val="20"/>
-              </w:rPr>
-              <w:t>S024 / P027</w:t>
-            </w:r>
-          </w:p>
-        </w:tc>
-        <w:tc>
-          <w:tcPr>
-            <w:tcW w:type="dxa" w:w="4752"/>
-            <w:shd w:fill="F5F7F9"/>
-            <w:vAlign w:val="center"/>
-          </w:tcPr>
-          <w:p>
-            <w:pPr>
-              <w:spacing w:after="80"/>
-            </w:pPr>
-            <w:r>
-              <w:rPr>
-                <w:b w:val="0"/>
-                <w:sz w:val="20"/>
-              </w:rPr>
-              <w:t>SGDRC</w:t>
-            </w:r>
-          </w:p>
-        </w:tc>
-        <w:tc>
-          <w:tcPr>
-            <w:tcW w:type="dxa" w:w="1728"/>
-            <w:shd w:fill="F5F7F9"/>
-            <w:vAlign w:val="center"/>
-          </w:tcPr>
-          <w:p>
-            <w:pPr>
-              <w:spacing w:after="80"/>
-            </w:pPr>
-            <w:r>
-              <w:rPr>
-                <w:b w:val="0"/>
-                <w:sz w:val="20"/>
-              </w:rPr>
-              <w:t>Rameen</w:t>
-            </w:r>
-          </w:p>
-        </w:tc>
-        <w:tc>
-          <w:tcPr>
-            <w:tcW w:type="dxa" w:w="1440"/>
-            <w:shd w:fill="F5F7F9"/>
-            <w:vAlign w:val="center"/>
-          </w:tcPr>
-          <w:p>
-            <w:pPr>
-              <w:spacing w:after="80"/>
-            </w:pPr>
-            <w:r>
-              <w:rPr>
-                <w:b w:val="0"/>
-                <w:sz w:val="20"/>
-              </w:rPr>
-              <w:t>2</w:t>
-            </w:r>
-          </w:p>
-        </w:tc>
-      </w:tr>
-      <w:tr>
-        <w:tc>
-          <w:tcPr>
-            <w:tcW w:type="dxa" w:w="2016"/>
-            <w:vAlign w:val="center"/>
-          </w:tcPr>
-          <w:p>
-            <w:pPr>
-              <w:spacing w:after="80"/>
-            </w:pPr>
-            <w:r>
-              <w:rPr>
-                <w:b w:val="0"/>
-                <w:sz w:val="20"/>
-              </w:rPr>
-              <w:t>S025 / P028</w:t>
-            </w:r>
-          </w:p>
-        </w:tc>
-        <w:tc>
-          <w:tcPr>
-            <w:tcW w:type="dxa" w:w="4752"/>
-            <w:vAlign w:val="center"/>
-          </w:tcPr>
-          <w:p>
-            <w:pPr>
-              <w:spacing w:after="80"/>
-            </w:pPr>
-            <w:r>
-              <w:rPr>
-                <w:b w:val="0"/>
-                <w:sz w:val="20"/>
-              </w:rPr>
-              <w:t>Pantheon</w:t>
-            </w:r>
-          </w:p>
-        </w:tc>
-        <w:tc>
-          <w:tcPr>
-            <w:tcW w:type="dxa" w:w="1728"/>
-            <w:vAlign w:val="center"/>
-          </w:tcPr>
-          <w:p>
-            <w:pPr>
-              <w:spacing w:after="80"/>
-            </w:pPr>
-            <w:r>
-              <w:rPr>
-                <w:b w:val="0"/>
-                <w:sz w:val="20"/>
-              </w:rPr>
-              <w:t>Eshaal</w:t>
-            </w:r>
-          </w:p>
-        </w:tc>
-        <w:tc>
-          <w:tcPr>
-            <w:tcW w:type="dxa" w:w="1440"/>
-            <w:vAlign w:val="center"/>
-          </w:tcPr>
-          <w:p>
-            <w:pPr>
-              <w:spacing w:after="80"/>
-            </w:pPr>
-            <w:r>
-              <w:rPr>
-                <w:b w:val="0"/>
-                <w:sz w:val="20"/>
-              </w:rPr>
-              <w:t>3</w:t>
-            </w:r>
-          </w:p>
-        </w:tc>
-      </w:tr>
-      <w:tr>
-        <w:tc>
-          <w:tcPr>
-            <w:tcW w:type="dxa" w:w="2016"/>
-            <w:shd w:fill="F5F7F9"/>
-            <w:vAlign w:val="center"/>
-          </w:tcPr>
-          <w:p>
-            <w:pPr>
-              <w:spacing w:after="80"/>
-            </w:pPr>
-            <w:r>
-              <w:rPr>
-                <w:b w:val="0"/>
-                <w:sz w:val="20"/>
-              </w:rPr>
-              <w:t>S026 / P029</w:t>
-            </w:r>
-          </w:p>
-        </w:tc>
-        <w:tc>
-          <w:tcPr>
-            <w:tcW w:type="dxa" w:w="4752"/>
-            <w:shd w:fill="F5F7F9"/>
-            <w:vAlign w:val="center"/>
-          </w:tcPr>
-          <w:p>
-            <w:pPr>
-              <w:spacing w:after="80"/>
-            </w:pPr>
-            <w:r>
-              <w:rPr>
-                <w:b w:val="0"/>
-                <w:sz w:val="20"/>
-              </w:rPr>
-              <w:t>Oneiros</w:t>
-            </w:r>
-          </w:p>
-        </w:tc>
-        <w:tc>
-          <w:tcPr>
-            <w:tcW w:type="dxa" w:w="1728"/>
-            <w:shd w:fill="F5F7F9"/>
-            <w:vAlign w:val="center"/>
-          </w:tcPr>
-          <w:p>
-            <w:pPr>
-              <w:spacing w:after="80"/>
-            </w:pPr>
-            <w:r>
-              <w:rPr>
-                <w:b w:val="0"/>
-                <w:sz w:val="20"/>
-              </w:rPr>
-              <w:t>Rameen</w:t>
-            </w:r>
-          </w:p>
-        </w:tc>
-        <w:tc>
-          <w:tcPr>
-            <w:tcW w:type="dxa" w:w="1440"/>
-            <w:shd w:fill="F5F7F9"/>
-            <w:vAlign w:val="center"/>
-          </w:tcPr>
-          <w:p>
-            <w:pPr>
-              <w:spacing w:after="80"/>
-            </w:pPr>
-            <w:r>
-              <w:rPr>
-                <w:b w:val="0"/>
-                <w:sz w:val="20"/>
-              </w:rPr>
-              <w:t>3</w:t>
-            </w:r>
-          </w:p>
-        </w:tc>
-      </w:tr>
-      <w:tr>
-        <w:tc>
-          <w:tcPr>
-            <w:tcW w:type="dxa" w:w="2016"/>
-            <w:vAlign w:val="center"/>
-          </w:tcPr>
-          <w:p>
-            <w:pPr>
-              <w:spacing w:after="80"/>
-            </w:pPr>
-            <w:r>
-              <w:rPr>
-                <w:b w:val="0"/>
-                <w:sz w:val="20"/>
-              </w:rPr>
-              <w:t>S027 / P030</w:t>
-            </w:r>
-          </w:p>
-        </w:tc>
-        <w:tc>
-          <w:tcPr>
-            <w:tcW w:type="dxa" w:w="4752"/>
-            <w:vAlign w:val="center"/>
-          </w:tcPr>
-          <w:p>
-            <w:pPr>
-              <w:spacing w:after="80"/>
-            </w:pPr>
-            <w:r>
-              <w:rPr>
-                <w:b w:val="0"/>
-                <w:sz w:val="20"/>
-              </w:rPr>
-              <w:t>GACER</w:t>
-            </w:r>
-          </w:p>
-        </w:tc>
-        <w:tc>
-          <w:tcPr>
-            <w:tcW w:type="dxa" w:w="1728"/>
-            <w:vAlign w:val="center"/>
-          </w:tcPr>
-          <w:p>
-            <w:pPr>
-              <w:spacing w:after="80"/>
-            </w:pPr>
-            <w:r>
-              <w:rPr>
-                <w:b w:val="0"/>
-                <w:sz w:val="20"/>
-              </w:rPr>
-              <w:t>Eshaal</w:t>
-            </w:r>
-          </w:p>
-        </w:tc>
-        <w:tc>
-          <w:tcPr>
-            <w:tcW w:type="dxa" w:w="1440"/>
-            <w:vAlign w:val="center"/>
-          </w:tcPr>
-          <w:p>
-            <w:pPr>
-              <w:spacing w:after="80"/>
-            </w:pPr>
-            <w:r>
-              <w:rPr>
-                <w:b w:val="0"/>
-                <w:sz w:val="20"/>
-              </w:rPr>
-              <w:t>4</w:t>
-            </w:r>
-          </w:p>
-        </w:tc>
-      </w:tr>
-      <w:tr>
-        <w:tc>
-          <w:tcPr>
-            <w:tcW w:type="dxa" w:w="2016"/>
-            <w:shd w:fill="F5F7F9"/>
-            <w:vAlign w:val="center"/>
-          </w:tcPr>
-          <w:p>
-            <w:pPr>
-              <w:spacing w:after="80"/>
-            </w:pPr>
-            <w:r>
-              <w:rPr>
-                <w:b w:val="0"/>
-                <w:sz w:val="20"/>
-              </w:rPr>
-              <w:t>S028 / P031</w:t>
-            </w:r>
-          </w:p>
-        </w:tc>
-        <w:tc>
-          <w:tcPr>
-            <w:tcW w:type="dxa" w:w="4752"/>
-            <w:shd w:fill="F5F7F9"/>
-            <w:vAlign w:val="center"/>
-          </w:tcPr>
-          <w:p>
-            <w:pPr>
-              <w:spacing w:after="80"/>
-            </w:pPr>
-            <w:r>
-              <w:rPr>
-                <w:b w:val="0"/>
-                <w:sz w:val="20"/>
-              </w:rPr>
-              <w:t>ElasticRoom</w:t>
-            </w:r>
-          </w:p>
-        </w:tc>
-        <w:tc>
-          <w:tcPr>
-            <w:tcW w:type="dxa" w:w="1728"/>
-            <w:shd w:fill="F5F7F9"/>
-            <w:vAlign w:val="center"/>
-          </w:tcPr>
-          <w:p>
-            <w:pPr>
-              <w:spacing w:after="80"/>
-            </w:pPr>
-            <w:r>
-              <w:rPr>
-                <w:b w:val="0"/>
-                <w:sz w:val="20"/>
-              </w:rPr>
-              <w:t>Rameen</w:t>
-            </w:r>
-          </w:p>
-        </w:tc>
-        <w:tc>
-          <w:tcPr>
-            <w:tcW w:type="dxa" w:w="1440"/>
-            <w:shd w:fill="F5F7F9"/>
-            <w:vAlign w:val="center"/>
-          </w:tcPr>
-          <w:p>
-            <w:pPr>
-              <w:spacing w:after="80"/>
-            </w:pPr>
-            <w:r>
-              <w:rPr>
-                <w:b w:val="0"/>
-                <w:sz w:val="20"/>
-              </w:rPr>
-              <w:t>8</w:t>
-            </w:r>
-          </w:p>
-        </w:tc>
-      </w:tr>
-      <w:tr>
-        <w:tc>
-          <w:tcPr>
-            <w:tcW w:type="dxa" w:w="2016"/>
-            <w:vAlign w:val="center"/>
-          </w:tcPr>
-          <w:p>
-            <w:pPr>
-              <w:spacing w:after="80"/>
-            </w:pPr>
-            <w:r>
-              <w:rPr>
-                <w:b w:val="0"/>
-                <w:sz w:val="20"/>
-              </w:rPr>
-              <w:t>S029 / P032</w:t>
-            </w:r>
-          </w:p>
-        </w:tc>
-        <w:tc>
-          <w:tcPr>
-            <w:tcW w:type="dxa" w:w="4752"/>
-            <w:vAlign w:val="center"/>
-          </w:tcPr>
-          <w:p>
-            <w:pPr>
-              <w:spacing w:after="80"/>
-            </w:pPr>
-            <w:r>
-              <w:rPr>
-                <w:b w:val="0"/>
-                <w:sz w:val="20"/>
-              </w:rPr>
-              <w:t>SPLIT</w:t>
-            </w:r>
-          </w:p>
-        </w:tc>
-        <w:tc>
-          <w:tcPr>
-            <w:tcW w:type="dxa" w:w="1728"/>
-            <w:vAlign w:val="center"/>
-          </w:tcPr>
-          <w:p>
-            <w:pPr>
-              <w:spacing w:after="80"/>
-            </w:pPr>
-            <w:r>
-              <w:rPr>
-                <w:b w:val="0"/>
-                <w:sz w:val="20"/>
-              </w:rPr>
-              <w:t>Eshaal</w:t>
-            </w:r>
-          </w:p>
-        </w:tc>
-        <w:tc>
-          <w:tcPr>
-            <w:tcW w:type="dxa" w:w="1440"/>
-            <w:vAlign w:val="center"/>
-          </w:tcPr>
-          <w:p>
-            <w:pPr>
-              <w:spacing w:after="80"/>
-            </w:pPr>
-            <w:r>
-              <w:rPr>
-                <w:b w:val="0"/>
-                <w:sz w:val="20"/>
-              </w:rPr>
-              <w:t>6</w:t>
-            </w:r>
-          </w:p>
-        </w:tc>
-      </w:tr>
-      <w:tr>
-        <w:tc>
-          <w:tcPr>
-            <w:tcW w:type="dxa" w:w="2016"/>
-            <w:shd w:fill="F5F7F9"/>
-            <w:vAlign w:val="center"/>
-          </w:tcPr>
-          <w:p>
-            <w:pPr>
-              <w:spacing w:after="80"/>
-            </w:pPr>
-            <w:r>
-              <w:rPr>
-                <w:b w:val="0"/>
-                <w:sz w:val="20"/>
-              </w:rPr>
-              <w:t>S030 / P033</w:t>
-            </w:r>
-          </w:p>
-        </w:tc>
-        <w:tc>
-          <w:tcPr>
-            <w:tcW w:type="dxa" w:w="4752"/>
-            <w:shd w:fill="F5F7F9"/>
-            <w:vAlign w:val="center"/>
-          </w:tcPr>
-          <w:p>
-            <w:pPr>
-              <w:spacing w:after="80"/>
-            </w:pPr>
-            <w:r>
-              <w:rPr>
-                <w:b w:val="0"/>
-                <w:sz w:val="20"/>
-              </w:rPr>
-              <w:t>KACE</w:t>
-            </w:r>
-          </w:p>
-        </w:tc>
-        <w:tc>
-          <w:tcPr>
-            <w:tcW w:type="dxa" w:w="1728"/>
-            <w:shd w:fill="F5F7F9"/>
-            <w:vAlign w:val="center"/>
-          </w:tcPr>
-          <w:p>
-            <w:pPr>
-              <w:spacing w:after="80"/>
-            </w:pPr>
-            <w:r>
-              <w:rPr>
-                <w:b w:val="0"/>
-                <w:sz w:val="20"/>
-              </w:rPr>
-              <w:t>Rameen</w:t>
-            </w:r>
-          </w:p>
-        </w:tc>
-        <w:tc>
-          <w:tcPr>
-            <w:tcW w:type="dxa" w:w="1440"/>
-            <w:shd w:fill="F5F7F9"/>
-            <w:vAlign w:val="center"/>
-          </w:tcPr>
-          <w:p>
-            <w:pPr>
-              <w:spacing w:after="80"/>
-            </w:pPr>
-            <w:r>
-              <w:rPr>
-                <w:b w:val="0"/>
-                <w:sz w:val="20"/>
-              </w:rPr>
-              <w:t>6</w:t>
-            </w:r>
-          </w:p>
-        </w:tc>
-      </w:tr>
-    </w:tbl>
-    <w:p>
-      <w:r>
-        <w:t>Each paper already has a source-based eligibility decision, ten QA items, extraction fields and cited findings in the draft. The ten additions contribute 60 eligibility checks, 100 QA items and 38 outcome rows. The older set contributes the other 200 QA items and 52 outcomes. These are item counts, not paper counts.</w:t>
+        <w:t>Research still open</w:t>
       </w:r>
     </w:p>
     <w:p>
       <w:r>
-        <w:t>The private bundle contains the ten new PDFs only. It does not claim to newly recover every original paper. Use earlier reading copies or the original source register for the older studies. Preserve any actual access/version limitation.</w:t>
-      </w:r>
-    </w:p>
-    <w:p>
-      <w:pPr>
-        <w:pStyle w:val="Heading1"/>
-      </w:pPr>
-      <w:r>
-        <w:t>What Eshaal and Rameen should do</w:t>
-      </w:r>
-    </w:p>
-    <w:p>
-      <w:r>
-        <w:t>The suggested split gives each checker five added papers. First confirm the publication identity and eligibility. Next check the main reported finding and its use in the report. Then inspect the QA and other assigned outcome rows. The CSV assigns every item, but you must leave an item unverified if you have not checked it.</w:t>
-      </w:r>
-    </w:p>
-    <w:p>
-      <w:r>
-        <w:t>Eshaal also checks Results, Comparison and Discussion. Look for percentages with the correct baseline, mean versus tail latency, and adverse results. Rameen also checks Methodology, Study Selection, QA and References. Check the 30/31 distinction, claim-specific N/A denominators and current counts.</w:t>
-      </w:r>
-    </w:p>
-    <w:p>
-      <w:r>
-        <w:t>Use your previous completed reviews for the original studies. Give priority to source identity, the central numerical claims and recommendations. Cosmetic rewriting can follow. The new queues are suggested independent checks, not a replacement for actual protocol requirements.</w:t>
-      </w:r>
-    </w:p>
-    <w:p>
-      <w:r>
-        <w:br w:type="page"/>
-      </w:r>
-    </w:p>
-    <w:p>
-      <w:pPr>
-        <w:pStyle w:val="Heading1"/>
-      </w:pPr>
-      <w:r>
-        <w:t>How to check one paper step by step</w:t>
-      </w:r>
-    </w:p>
-    <w:p>
-      <w:pPr>
-        <w:pStyle w:val="Heading2"/>
-      </w:pPr>
-      <w:r>
-        <w:t>Publication identity</w:t>
-      </w:r>
-    </w:p>
-    <w:p>
-      <w:r>
-        <w:t>Compare the PDF first page with Studies and New_Paper_Map.csv. Check title, authors, year, venue and DOI. A preprint and a final paper can differ; record the actual version.</w:t>
-      </w:r>
-    </w:p>
-    <w:p>
-      <w:pPr>
-        <w:pStyle w:val="Heading2"/>
-      </w:pPr>
-      <w:r>
-        <w:t>Eligibility</w:t>
-      </w:r>
-    </w:p>
-    <w:p>
-      <w:r>
-        <w:t>Read IC1 to IC6 in the protocol and the recorded criterion anchors. Confirm a relevant sharing mechanism, separable inference evidence and a within-one-GPU result. A download or abstract alone is insufficient.</w:t>
-      </w:r>
-    </w:p>
-    <w:p>
-      <w:pPr>
-        <w:pStyle w:val="Heading2"/>
-      </w:pPr>
-      <w:r>
-        <w:t>Quality appraisal</w:t>
-      </w:r>
-    </w:p>
-    <w:p>
-      <w:r>
-        <w:t>Find Q1 to Q10 in the QA sheet. Read the rationale and cited page. Check the score against the scoring rule. N/A must mean that the paper does not make that type of claim; it must not conceal missing evidence for a claim.</w:t>
-      </w:r>
-    </w:p>
-    <w:p>
-      <w:pPr>
-        <w:pStyle w:val="Heading2"/>
-      </w:pPr>
-      <w:r>
-        <w:t>Data extraction</w:t>
-      </w:r>
-    </w:p>
-    <w:p>
-      <w:r>
-        <w:t>Compare mechanism, hardware, workload, tenant count, load, baseline and metric definition with the paper. Keep the source conditions attached to the result.</w:t>
-      </w:r>
-    </w:p>
-    <w:p>
-      <w:pPr>
-        <w:pStyle w:val="Heading2"/>
-      </w:pPr>
-      <w:r>
-        <w:t>Outcome and synthesis</w:t>
-      </w:r>
-    </w:p>
-    <w:p>
-      <w:r>
-        <w:t>Open Evidence and locate the outcome ID. Verify value, units, comparator and source anchor. Find the corresponding claim in the report, then check that its conclusion respects the source limits.</w:t>
-      </w:r>
-    </w:p>
-    <w:p>
-      <w:pPr>
-        <w:pStyle w:val="Heading2"/>
-      </w:pPr>
-      <w:r>
-        <w:t>Return a correction</w:t>
-      </w:r>
-    </w:p>
-    <w:p>
-      <w:r>
-        <w:t>Enter the item ID, source page, actual finding, checker name and date. Use Agree or Correction needed only after reading the relevant evidence. Put proposed changes in the correction inbox and let Raazia update the master once.</w:t>
-      </w:r>
-    </w:p>
-    <w:p>
-      <w:r>
-        <w:t>Example: KACE reports 92.3% of an offline oracle throughput sum for its unseen GPT2-xl target. This is not a 92.3% latency reduction or a p99 guarantee. A correction must preserve the metric, target workload and oracle denominator.</w:t>
-      </w:r>
-    </w:p>
-    <w:p>
-      <w:r>
-        <w:t>Example: SPLIT uses block-execution-time dispersion as a jitter measure. Do not rename it end-to-end request-tail jitter. Some splits add execution overhead; keep those adverse costs in the review.</w:t>
-      </w:r>
-    </w:p>
-    <w:p>
-      <w:pPr>
-        <w:pStyle w:val="Heading1"/>
-      </w:pPr>
-      <w:r>
-        <w:t>How Raazia should merge corrections</w:t>
-      </w:r>
-    </w:p>
-    <w:p>
-      <w:r>
-        <w:t>Keep one master workbook and one LaTeX project. Check each proposed correction against its source, update the owning data row and any affected report claim, then rebuild the PDF. Update the Word companion after accepted changes. Recheck counts only when an eligibility or identity decision changes. Record the final Git commit and submitted file hashes.</w:t>
-      </w:r>
-    </w:p>
-    <w:p>
-      <w:r>
-        <w:br w:type="page"/>
-      </w:r>
-    </w:p>
-    <w:p>
-      <w:pPr>
-        <w:pStyle w:val="Heading1"/>
-      </w:pPr>
-      <w:r>
-        <w:t>Sir mandatory deliverables</w:t>
-      </w:r>
-    </w:p>
-    <w:p>
-      <w:r>
-        <w:t>Heading 23 lists 25 deliverables. The following table maps every item. Present means that draft content exists; it does not certify that the associated research question or audit is fully closed. Guideline_23_Deliverables.csv contains the full actions and file locations.</w:t>
-      </w:r>
-    </w:p>
-    <w:tbl>
-      <w:tblPr>
-        <w:tblW w:type="auto" w:w="0"/>
-        <w:tblLayout w:type="fixed"/>
-        <w:tblLook w:firstColumn="1" w:firstRow="1" w:lastColumn="0" w:lastRow="0" w:noHBand="0" w:noVBand="1" w:val="04A0"/>
-        <w:tblBorders>
-          <w:top w:val="single" w:sz="4" w:color="D9D9D9"/>
-          <w:left w:val="single" w:sz="4" w:color="D9D9D9"/>
-          <w:bottom w:val="single" w:sz="4" w:color="D9D9D9"/>
-          <w:right w:val="single" w:sz="4" w:color="D9D9D9"/>
-          <w:insideH w:val="single" w:sz="4" w:color="D9D9D9"/>
-          <w:insideV w:val="single" w:sz="4" w:color="D9D9D9"/>
-        </w:tblBorders>
-      </w:tblPr>
-      <w:tblGrid>
-        <w:gridCol w:w="2520"/>
-        <w:gridCol w:w="2520"/>
-        <w:gridCol w:w="2520"/>
-        <w:gridCol w:w="2520"/>
-      </w:tblGrid>
-      <w:tr>
-        <w:trPr>
-          <w:tblHeader/>
-        </w:trPr>
-        <w:tc>
-          <w:tcPr>
-            <w:tcW w:type="dxa" w:w="504"/>
-            <w:shd w:fill="E8EDF2"/>
-            <w:vAlign w:val="center"/>
-          </w:tcPr>
-          <w:p>
-            <w:pPr>
-              <w:spacing w:after="80"/>
-            </w:pPr>
-            <w:r>
-              <w:rPr>
-                <w:b/>
-                <w:sz w:val="20"/>
-              </w:rPr>
-              <w:t>No</w:t>
-            </w:r>
-          </w:p>
-        </w:tc>
-        <w:tc>
-          <w:tcPr>
-            <w:tcW w:type="dxa" w:w="3024"/>
-            <w:shd w:fill="E8EDF2"/>
-            <w:vAlign w:val="center"/>
-          </w:tcPr>
-          <w:p>
-            <w:pPr>
-              <w:spacing w:after="80"/>
-            </w:pPr>
-            <w:r>
-              <w:rPr>
-                <w:b/>
-                <w:sz w:val="20"/>
-              </w:rPr>
-              <w:t>Requirement</w:t>
-            </w:r>
-          </w:p>
-        </w:tc>
-        <w:tc>
-          <w:tcPr>
-            <w:tcW w:type="dxa" w:w="3888"/>
-            <w:shd w:fill="E8EDF2"/>
-            <w:vAlign w:val="center"/>
-          </w:tcPr>
-          <w:p>
-            <w:pPr>
-              <w:spacing w:after="80"/>
-            </w:pPr>
-            <w:r>
-              <w:rPr>
-                <w:b/>
-                <w:sz w:val="20"/>
-              </w:rPr>
-              <w:t>Location</w:t>
-            </w:r>
-          </w:p>
-        </w:tc>
-        <w:tc>
-          <w:tcPr>
-            <w:tcW w:type="dxa" w:w="2520"/>
-            <w:shd w:fill="E8EDF2"/>
-            <w:vAlign w:val="center"/>
-          </w:tcPr>
-          <w:p>
-            <w:pPr>
-              <w:spacing w:after="80"/>
-            </w:pPr>
-            <w:r>
-              <w:rPr>
-                <w:b/>
-                <w:sz w:val="20"/>
-              </w:rPr>
-              <w:t>Status</w:t>
-            </w:r>
-          </w:p>
-        </w:tc>
-      </w:tr>
-      <w:tr>
-        <w:tc>
-          <w:tcPr>
-            <w:tcW w:type="dxa" w:w="504"/>
-            <w:vAlign w:val="center"/>
-          </w:tcPr>
-          <w:p>
-            <w:pPr>
-              <w:spacing w:after="80"/>
-            </w:pPr>
-            <w:r>
-              <w:rPr>
-                <w:b w:val="0"/>
-                <w:sz w:val="20"/>
-              </w:rPr>
-              <w:t>1</w:t>
-            </w:r>
-          </w:p>
-        </w:tc>
-        <w:tc>
-          <w:tcPr>
-            <w:tcW w:type="dxa" w:w="3024"/>
-            <w:vAlign w:val="center"/>
-          </w:tcPr>
-          <w:p>
-            <w:pPr>
-              <w:spacing w:after="80"/>
-            </w:pPr>
-            <w:r>
-              <w:rPr>
-                <w:b w:val="0"/>
-                <w:sz w:val="20"/>
-              </w:rPr>
-              <w:t>Final SLR report</w:t>
-            </w:r>
-          </w:p>
-        </w:tc>
-        <w:tc>
-          <w:tcPr>
-            <w:tcW w:type="dxa" w:w="3888"/>
-            <w:vAlign w:val="center"/>
-          </w:tcPr>
-          <w:p>
-            <w:pPr>
-              <w:spacing w:after="80"/>
-            </w:pPr>
-            <w:r>
-              <w:rPr>
-                <w:b w:val="0"/>
-                <w:sz w:val="20"/>
-              </w:rPr>
-              <w:t>01_Report PDF and Word</w:t>
-            </w:r>
-          </w:p>
-        </w:tc>
-        <w:tc>
-          <w:tcPr>
-            <w:tcW w:type="dxa" w:w="2520"/>
-            <w:vAlign w:val="center"/>
-          </w:tcPr>
-          <w:p>
-            <w:pPr>
-              <w:spacing w:after="80"/>
-            </w:pPr>
-            <w:r>
-              <w:rPr>
-                <w:b w:val="0"/>
-                <w:sz w:val="20"/>
-              </w:rPr>
-              <w:t>Draft prepared</w:t>
-            </w:r>
-          </w:p>
-        </w:tc>
-      </w:tr>
-      <w:tr>
-        <w:tc>
-          <w:tcPr>
-            <w:tcW w:type="dxa" w:w="504"/>
-            <w:shd w:fill="F5F7F9"/>
-            <w:vAlign w:val="center"/>
-          </w:tcPr>
-          <w:p>
-            <w:pPr>
-              <w:spacing w:after="80"/>
-            </w:pPr>
-            <w:r>
-              <w:rPr>
-                <w:b w:val="0"/>
-                <w:sz w:val="20"/>
-              </w:rPr>
-              <w:t>2</w:t>
-            </w:r>
-          </w:p>
-        </w:tc>
-        <w:tc>
-          <w:tcPr>
-            <w:tcW w:type="dxa" w:w="3024"/>
-            <w:shd w:fill="F5F7F9"/>
-            <w:vAlign w:val="center"/>
-          </w:tcPr>
-          <w:p>
-            <w:pPr>
-              <w:spacing w:after="80"/>
-            </w:pPr>
-            <w:r>
-              <w:rPr>
-                <w:b w:val="0"/>
-                <w:sz w:val="20"/>
-              </w:rPr>
-              <w:t>Defined engineering problem</w:t>
-            </w:r>
-          </w:p>
-        </w:tc>
-        <w:tc>
-          <w:tcPr>
-            <w:tcW w:type="dxa" w:w="3888"/>
-            <w:shd w:fill="F5F7F9"/>
-            <w:vAlign w:val="center"/>
-          </w:tcPr>
-          <w:p>
-            <w:pPr>
-              <w:spacing w:after="80"/>
-            </w:pPr>
-            <w:r>
-              <w:rPr>
-                <w:b w:val="0"/>
-                <w:sz w:val="20"/>
-              </w:rPr>
-              <w:t>Report section 1</w:t>
-            </w:r>
-          </w:p>
-        </w:tc>
-        <w:tc>
-          <w:tcPr>
-            <w:tcW w:type="dxa" w:w="2520"/>
-            <w:shd w:fill="F5F7F9"/>
-            <w:vAlign w:val="center"/>
-          </w:tcPr>
-          <w:p>
-            <w:pPr>
-              <w:spacing w:after="80"/>
-            </w:pPr>
-            <w:r>
-              <w:rPr>
-                <w:b w:val="0"/>
-                <w:sz w:val="20"/>
-              </w:rPr>
-              <w:t>Present</w:t>
-            </w:r>
-          </w:p>
-        </w:tc>
-      </w:tr>
-      <w:tr>
-        <w:tc>
-          <w:tcPr>
-            <w:tcW w:type="dxa" w:w="504"/>
-            <w:vAlign w:val="center"/>
-          </w:tcPr>
-          <w:p>
-            <w:pPr>
-              <w:spacing w:after="80"/>
-            </w:pPr>
-            <w:r>
-              <w:rPr>
-                <w:b w:val="0"/>
-                <w:sz w:val="20"/>
-              </w:rPr>
-              <w:t>3</w:t>
-            </w:r>
-          </w:p>
-        </w:tc>
-        <w:tc>
-          <w:tcPr>
-            <w:tcW w:type="dxa" w:w="3024"/>
-            <w:vAlign w:val="center"/>
-          </w:tcPr>
-          <w:p>
-            <w:pPr>
-              <w:spacing w:after="80"/>
-            </w:pPr>
-            <w:r>
-              <w:rPr>
-                <w:b w:val="0"/>
-                <w:sz w:val="20"/>
-              </w:rPr>
-              <w:t>Research objectives</w:t>
-            </w:r>
-          </w:p>
-        </w:tc>
-        <w:tc>
-          <w:tcPr>
-            <w:tcW w:type="dxa" w:w="3888"/>
-            <w:vAlign w:val="center"/>
-          </w:tcPr>
-          <w:p>
-            <w:pPr>
-              <w:spacing w:after="80"/>
-            </w:pPr>
-            <w:r>
-              <w:rPr>
-                <w:b w:val="0"/>
-                <w:sz w:val="20"/>
-              </w:rPr>
-              <w:t>Report section 1</w:t>
-            </w:r>
-          </w:p>
-        </w:tc>
-        <w:tc>
-          <w:tcPr>
-            <w:tcW w:type="dxa" w:w="2520"/>
-            <w:vAlign w:val="center"/>
-          </w:tcPr>
-          <w:p>
-            <w:pPr>
-              <w:spacing w:after="80"/>
-            </w:pPr>
-            <w:r>
-              <w:rPr>
-                <w:b w:val="0"/>
-                <w:sz w:val="20"/>
-              </w:rPr>
-              <w:t>Present</w:t>
-            </w:r>
-          </w:p>
-        </w:tc>
-      </w:tr>
-      <w:tr>
-        <w:tc>
-          <w:tcPr>
-            <w:tcW w:type="dxa" w:w="504"/>
-            <w:shd w:fill="F5F7F9"/>
-            <w:vAlign w:val="center"/>
-          </w:tcPr>
-          <w:p>
-            <w:pPr>
-              <w:spacing w:after="80"/>
-            </w:pPr>
-            <w:r>
-              <w:rPr>
-                <w:b w:val="0"/>
-                <w:sz w:val="20"/>
-              </w:rPr>
-              <w:t>4</w:t>
-            </w:r>
-          </w:p>
-        </w:tc>
-        <w:tc>
-          <w:tcPr>
-            <w:tcW w:type="dxa" w:w="3024"/>
-            <w:shd w:fill="F5F7F9"/>
-            <w:vAlign w:val="center"/>
-          </w:tcPr>
-          <w:p>
-            <w:pPr>
-              <w:spacing w:after="80"/>
-            </w:pPr>
-            <w:r>
-              <w:rPr>
-                <w:b w:val="0"/>
-                <w:sz w:val="20"/>
-              </w:rPr>
-              <w:t>Three to five RQs</w:t>
-            </w:r>
-          </w:p>
-        </w:tc>
-        <w:tc>
-          <w:tcPr>
-            <w:tcW w:type="dxa" w:w="3888"/>
-            <w:shd w:fill="F5F7F9"/>
-            <w:vAlign w:val="center"/>
-          </w:tcPr>
-          <w:p>
-            <w:pPr>
-              <w:spacing w:after="80"/>
-            </w:pPr>
-            <w:r>
-              <w:rPr>
-                <w:b w:val="0"/>
-                <w:sz w:val="20"/>
-              </w:rPr>
-              <w:t>Report section 2</w:t>
-            </w:r>
-          </w:p>
-        </w:tc>
-        <w:tc>
-          <w:tcPr>
-            <w:tcW w:type="dxa" w:w="2520"/>
-            <w:shd w:fill="F5F7F9"/>
-            <w:vAlign w:val="center"/>
-          </w:tcPr>
-          <w:p>
-            <w:pPr>
-              <w:spacing w:after="80"/>
-            </w:pPr>
-            <w:r>
-              <w:rPr>
-                <w:b w:val="0"/>
-                <w:sz w:val="20"/>
-              </w:rPr>
-              <w:t>Present</w:t>
-            </w:r>
-          </w:p>
-        </w:tc>
-      </w:tr>
-      <w:tr>
-        <w:tc>
-          <w:tcPr>
-            <w:tcW w:type="dxa" w:w="504"/>
-            <w:vAlign w:val="center"/>
-          </w:tcPr>
-          <w:p>
-            <w:pPr>
-              <w:spacing w:after="80"/>
-            </w:pPr>
-            <w:r>
-              <w:rPr>
-                <w:b w:val="0"/>
-                <w:sz w:val="20"/>
-              </w:rPr>
-              <w:t>5</w:t>
-            </w:r>
-          </w:p>
-        </w:tc>
-        <w:tc>
-          <w:tcPr>
-            <w:tcW w:type="dxa" w:w="3024"/>
-            <w:vAlign w:val="center"/>
-          </w:tcPr>
-          <w:p>
-            <w:pPr>
-              <w:spacing w:after="80"/>
-            </w:pPr>
-            <w:r>
-              <w:rPr>
-                <w:b w:val="0"/>
-                <w:sz w:val="20"/>
-              </w:rPr>
-              <w:t>SLR protocol</w:t>
-            </w:r>
-          </w:p>
-        </w:tc>
-        <w:tc>
-          <w:tcPr>
-            <w:tcW w:type="dxa" w:w="3888"/>
-            <w:vAlign w:val="center"/>
-          </w:tcPr>
-          <w:p>
-            <w:pPr>
-              <w:spacing w:after="80"/>
-            </w:pPr>
-            <w:r>
-              <w:rPr>
-                <w:b w:val="0"/>
-                <w:sz w:val="20"/>
-              </w:rPr>
-              <w:t>06_Protocol_and_Guidelines and methodology</w:t>
-            </w:r>
-          </w:p>
-        </w:tc>
-        <w:tc>
-          <w:tcPr>
-            <w:tcW w:type="dxa" w:w="2520"/>
-            <w:vAlign w:val="center"/>
-          </w:tcPr>
-          <w:p>
-            <w:pPr>
-              <w:spacing w:after="80"/>
-            </w:pPr>
-            <w:r>
-              <w:rPr>
-                <w:b w:val="0"/>
-                <w:sz w:val="20"/>
-              </w:rPr>
-              <w:t>Present</w:t>
-            </w:r>
-          </w:p>
-        </w:tc>
-      </w:tr>
-      <w:tr>
-        <w:tc>
-          <w:tcPr>
-            <w:tcW w:type="dxa" w:w="504"/>
-            <w:shd w:fill="F5F7F9"/>
-            <w:vAlign w:val="center"/>
-          </w:tcPr>
-          <w:p>
-            <w:pPr>
-              <w:spacing w:after="80"/>
-            </w:pPr>
-            <w:r>
-              <w:rPr>
-                <w:b w:val="0"/>
-                <w:sz w:val="20"/>
-              </w:rPr>
-              <w:t>6</w:t>
-            </w:r>
-          </w:p>
-        </w:tc>
-        <w:tc>
-          <w:tcPr>
-            <w:tcW w:type="dxa" w:w="3024"/>
-            <w:shd w:fill="F5F7F9"/>
-            <w:vAlign w:val="center"/>
-          </w:tcPr>
-          <w:p>
-            <w:pPr>
-              <w:spacing w:after="80"/>
-            </w:pPr>
-            <w:r>
-              <w:rPr>
-                <w:b w:val="0"/>
-                <w:sz w:val="20"/>
-              </w:rPr>
-              <w:t>Databases and justification</w:t>
-            </w:r>
-          </w:p>
-        </w:tc>
-        <w:tc>
-          <w:tcPr>
-            <w:tcW w:type="dxa" w:w="3888"/>
-            <w:shd w:fill="F5F7F9"/>
-            <w:vAlign w:val="center"/>
-          </w:tcPr>
-          <w:p>
-            <w:pPr>
-              <w:spacing w:after="80"/>
-            </w:pPr>
-            <w:r>
-              <w:rPr>
-                <w:b w:val="0"/>
-                <w:sz w:val="20"/>
-              </w:rPr>
-              <w:t>Report section 3 and Search_Log.csv</w:t>
-            </w:r>
-          </w:p>
-        </w:tc>
-        <w:tc>
-          <w:tcPr>
-            <w:tcW w:type="dxa" w:w="2520"/>
-            <w:shd w:fill="F5F7F9"/>
-            <w:vAlign w:val="center"/>
-          </w:tcPr>
-          <w:p>
-            <w:pPr>
-              <w:spacing w:after="80"/>
-            </w:pPr>
-            <w:r>
-              <w:rPr>
-                <w:b w:val="0"/>
-                <w:sz w:val="20"/>
-              </w:rPr>
-              <w:t>Present</w:t>
-            </w:r>
-          </w:p>
-        </w:tc>
-      </w:tr>
-      <w:tr>
-        <w:tc>
-          <w:tcPr>
-            <w:tcW w:type="dxa" w:w="504"/>
-            <w:vAlign w:val="center"/>
-          </w:tcPr>
-          <w:p>
-            <w:pPr>
-              <w:spacing w:after="80"/>
-            </w:pPr>
-            <w:r>
-              <w:rPr>
-                <w:b w:val="0"/>
-                <w:sz w:val="20"/>
-              </w:rPr>
-              <w:t>7</w:t>
-            </w:r>
-          </w:p>
-        </w:tc>
-        <w:tc>
-          <w:tcPr>
-            <w:tcW w:type="dxa" w:w="3024"/>
-            <w:vAlign w:val="center"/>
-          </w:tcPr>
-          <w:p>
-            <w:pPr>
-              <w:spacing w:after="80"/>
-            </w:pPr>
-            <w:r>
-              <w:rPr>
-                <w:b w:val="0"/>
-                <w:sz w:val="20"/>
-              </w:rPr>
-              <w:t>Exact search strings</w:t>
-            </w:r>
-          </w:p>
-        </w:tc>
-        <w:tc>
-          <w:tcPr>
-            <w:tcW w:type="dxa" w:w="3888"/>
-            <w:vAlign w:val="center"/>
-          </w:tcPr>
-          <w:p>
-            <w:pPr>
-              <w:spacing w:after="80"/>
-            </w:pPr>
-            <w:r>
-              <w:rPr>
-                <w:b w:val="0"/>
-                <w:sz w:val="20"/>
-              </w:rPr>
-              <w:t>Report appendix and search register</w:t>
-            </w:r>
-          </w:p>
-        </w:tc>
-        <w:tc>
-          <w:tcPr>
-            <w:tcW w:type="dxa" w:w="2520"/>
-            <w:vAlign w:val="center"/>
-          </w:tcPr>
-          <w:p>
-            <w:pPr>
-              <w:spacing w:after="80"/>
-            </w:pPr>
-            <w:r>
-              <w:rPr>
-                <w:b w:val="0"/>
-                <w:sz w:val="20"/>
-              </w:rPr>
-              <w:t>Partly closed</w:t>
-            </w:r>
-          </w:p>
-        </w:tc>
-      </w:tr>
-      <w:tr>
-        <w:tc>
-          <w:tcPr>
-            <w:tcW w:type="dxa" w:w="504"/>
-            <w:shd w:fill="F5F7F9"/>
-            <w:vAlign w:val="center"/>
-          </w:tcPr>
-          <w:p>
-            <w:pPr>
-              <w:spacing w:after="80"/>
-            </w:pPr>
-            <w:r>
-              <w:rPr>
-                <w:b w:val="0"/>
-                <w:sz w:val="20"/>
-              </w:rPr>
-              <w:t>8</w:t>
-            </w:r>
-          </w:p>
-        </w:tc>
-        <w:tc>
-          <w:tcPr>
-            <w:tcW w:type="dxa" w:w="3024"/>
-            <w:shd w:fill="F5F7F9"/>
-            <w:vAlign w:val="center"/>
-          </w:tcPr>
-          <w:p>
-            <w:pPr>
-              <w:spacing w:after="80"/>
-            </w:pPr>
-            <w:r>
-              <w:rPr>
-                <w:b w:val="0"/>
-                <w:sz w:val="20"/>
-              </w:rPr>
-              <w:t>Inclusion and exclusion criteria</w:t>
-            </w:r>
-          </w:p>
-        </w:tc>
-        <w:tc>
-          <w:tcPr>
-            <w:tcW w:type="dxa" w:w="3888"/>
-            <w:shd w:fill="F5F7F9"/>
-            <w:vAlign w:val="center"/>
-          </w:tcPr>
-          <w:p>
-            <w:pPr>
-              <w:spacing w:after="80"/>
-            </w:pPr>
-            <w:r>
-              <w:rPr>
-                <w:b w:val="0"/>
-                <w:sz w:val="20"/>
-              </w:rPr>
-              <w:t>Report section 3 and Eligibility.csv</w:t>
-            </w:r>
-          </w:p>
-        </w:tc>
-        <w:tc>
-          <w:tcPr>
-            <w:tcW w:type="dxa" w:w="2520"/>
-            <w:shd w:fill="F5F7F9"/>
-            <w:vAlign w:val="center"/>
-          </w:tcPr>
-          <w:p>
-            <w:pPr>
-              <w:spacing w:after="80"/>
-            </w:pPr>
-            <w:r>
-              <w:rPr>
-                <w:b w:val="0"/>
-                <w:sz w:val="20"/>
-              </w:rPr>
-              <w:t>Present</w:t>
-            </w:r>
-          </w:p>
-        </w:tc>
-      </w:tr>
-      <w:tr>
-        <w:tc>
-          <w:tcPr>
-            <w:tcW w:type="dxa" w:w="504"/>
-            <w:vAlign w:val="center"/>
-          </w:tcPr>
-          <w:p>
-            <w:pPr>
-              <w:spacing w:after="80"/>
-            </w:pPr>
-            <w:r>
-              <w:rPr>
-                <w:b w:val="0"/>
-                <w:sz w:val="20"/>
-              </w:rPr>
-              <w:t>9</w:t>
-            </w:r>
-          </w:p>
-        </w:tc>
-        <w:tc>
-          <w:tcPr>
-            <w:tcW w:type="dxa" w:w="3024"/>
-            <w:vAlign w:val="center"/>
-          </w:tcPr>
-          <w:p>
-            <w:pPr>
-              <w:spacing w:after="80"/>
-            </w:pPr>
-            <w:r>
-              <w:rPr>
-                <w:b w:val="0"/>
-                <w:sz w:val="20"/>
-              </w:rPr>
-              <w:t>Database wise search results</w:t>
-            </w:r>
-          </w:p>
-        </w:tc>
-        <w:tc>
-          <w:tcPr>
-            <w:tcW w:type="dxa" w:w="3888"/>
-            <w:vAlign w:val="center"/>
-          </w:tcPr>
-          <w:p>
-            <w:pPr>
-              <w:spacing w:after="80"/>
-            </w:pPr>
-            <w:r>
-              <w:rPr>
-                <w:b w:val="0"/>
-                <w:sz w:val="20"/>
-              </w:rPr>
-              <w:t>Search_Log.csv and report section 4</w:t>
-            </w:r>
-          </w:p>
-        </w:tc>
-        <w:tc>
-          <w:tcPr>
-            <w:tcW w:type="dxa" w:w="2520"/>
-            <w:vAlign w:val="center"/>
-          </w:tcPr>
-          <w:p>
-            <w:pPr>
-              <w:spacing w:after="80"/>
-            </w:pPr>
-            <w:r>
-              <w:rPr>
-                <w:b w:val="0"/>
-                <w:sz w:val="20"/>
-              </w:rPr>
-              <w:t>Partly closed</w:t>
-            </w:r>
-          </w:p>
-        </w:tc>
-      </w:tr>
-      <w:tr>
-        <w:tc>
-          <w:tcPr>
-            <w:tcW w:type="dxa" w:w="504"/>
-            <w:shd w:fill="F5F7F9"/>
-            <w:vAlign w:val="center"/>
-          </w:tcPr>
-          <w:p>
-            <w:pPr>
-              <w:spacing w:after="80"/>
-            </w:pPr>
-            <w:r>
-              <w:rPr>
-                <w:b w:val="0"/>
-                <w:sz w:val="20"/>
-              </w:rPr>
-              <w:t>10</w:t>
-            </w:r>
-          </w:p>
-        </w:tc>
-        <w:tc>
-          <w:tcPr>
-            <w:tcW w:type="dxa" w:w="3024"/>
-            <w:shd w:fill="F5F7F9"/>
-            <w:vAlign w:val="center"/>
-          </w:tcPr>
-          <w:p>
-            <w:pPr>
-              <w:spacing w:after="80"/>
-            </w:pPr>
-            <w:r>
-              <w:rPr>
-                <w:b w:val="0"/>
-                <w:sz w:val="20"/>
-              </w:rPr>
-              <w:t>Search and screening log</w:t>
-            </w:r>
-          </w:p>
-        </w:tc>
-        <w:tc>
-          <w:tcPr>
-            <w:tcW w:type="dxa" w:w="3888"/>
-            <w:shd w:fill="F5F7F9"/>
-            <w:vAlign w:val="center"/>
-          </w:tcPr>
-          <w:p>
-            <w:pPr>
-              <w:spacing w:after="80"/>
-            </w:pPr>
-            <w:r>
-              <w:rPr>
-                <w:b w:val="0"/>
-                <w:sz w:val="20"/>
-              </w:rPr>
-              <w:t>Screening_Log.csv and Final_Screening_Decisions.csv</w:t>
-            </w:r>
-          </w:p>
-        </w:tc>
-        <w:tc>
-          <w:tcPr>
-            <w:tcW w:type="dxa" w:w="2520"/>
-            <w:shd w:fill="F5F7F9"/>
-            <w:vAlign w:val="center"/>
-          </w:tcPr>
-          <w:p>
-            <w:pPr>
-              <w:spacing w:after="80"/>
-            </w:pPr>
-            <w:r>
-              <w:rPr>
-                <w:b w:val="0"/>
-                <w:sz w:val="20"/>
-              </w:rPr>
-              <w:t>Partly closed</w:t>
-            </w:r>
-          </w:p>
-        </w:tc>
-      </w:tr>
-      <w:tr>
-        <w:tc>
-          <w:tcPr>
-            <w:tcW w:type="dxa" w:w="504"/>
-            <w:vAlign w:val="center"/>
-          </w:tcPr>
-          <w:p>
-            <w:pPr>
-              <w:spacing w:after="80"/>
-            </w:pPr>
-            <w:r>
-              <w:rPr>
-                <w:b w:val="0"/>
-                <w:sz w:val="20"/>
-              </w:rPr>
-              <w:t>11</w:t>
-            </w:r>
-          </w:p>
-        </w:tc>
-        <w:tc>
-          <w:tcPr>
-            <w:tcW w:type="dxa" w:w="3024"/>
-            <w:vAlign w:val="center"/>
-          </w:tcPr>
-          <w:p>
-            <w:pPr>
-              <w:spacing w:after="80"/>
-            </w:pPr>
-            <w:r>
-              <w:rPr>
-                <w:b w:val="0"/>
-                <w:sz w:val="20"/>
-              </w:rPr>
-              <w:t>Duplicate removal record</w:t>
-            </w:r>
-          </w:p>
-        </w:tc>
-        <w:tc>
-          <w:tcPr>
-            <w:tcW w:type="dxa" w:w="3888"/>
-            <w:vAlign w:val="center"/>
-          </w:tcPr>
-          <w:p>
-            <w:pPr>
-              <w:spacing w:after="80"/>
-            </w:pPr>
-            <w:r>
-              <w:rPr>
-                <w:b w:val="0"/>
-                <w:sz w:val="20"/>
-              </w:rPr>
-              <w:t>Duplicate_Removal.csv and identity audit</w:t>
-            </w:r>
-          </w:p>
-        </w:tc>
-        <w:tc>
-          <w:tcPr>
-            <w:tcW w:type="dxa" w:w="2520"/>
-            <w:vAlign w:val="center"/>
-          </w:tcPr>
-          <w:p>
-            <w:pPr>
-              <w:spacing w:after="80"/>
-            </w:pPr>
-            <w:r>
-              <w:rPr>
-                <w:b w:val="0"/>
-                <w:sz w:val="20"/>
-              </w:rPr>
-              <w:t>Documented with limits</w:t>
-            </w:r>
-          </w:p>
-        </w:tc>
-      </w:tr>
-      <w:tr>
-        <w:tc>
-          <w:tcPr>
-            <w:tcW w:type="dxa" w:w="504"/>
-            <w:shd w:fill="F5F7F9"/>
-            <w:vAlign w:val="center"/>
-          </w:tcPr>
-          <w:p>
-            <w:pPr>
-              <w:spacing w:after="80"/>
-            </w:pPr>
-            <w:r>
-              <w:rPr>
-                <w:b w:val="0"/>
-                <w:sz w:val="20"/>
-              </w:rPr>
-              <w:t>12</w:t>
-            </w:r>
-          </w:p>
-        </w:tc>
-        <w:tc>
-          <w:tcPr>
-            <w:tcW w:type="dxa" w:w="3024"/>
-            <w:shd w:fill="F5F7F9"/>
-            <w:vAlign w:val="center"/>
-          </w:tcPr>
-          <w:p>
-            <w:pPr>
-              <w:spacing w:after="80"/>
-            </w:pPr>
-            <w:r>
-              <w:rPr>
-                <w:b w:val="0"/>
-                <w:sz w:val="20"/>
-              </w:rPr>
-              <w:t>PRISMA flow diagram</w:t>
-            </w:r>
-          </w:p>
-        </w:tc>
-        <w:tc>
-          <w:tcPr>
-            <w:tcW w:type="dxa" w:w="3888"/>
-            <w:shd w:fill="F5F7F9"/>
-            <w:vAlign w:val="center"/>
-          </w:tcPr>
-          <w:p>
-            <w:pPr>
-              <w:spacing w:after="80"/>
-            </w:pPr>
-            <w:r>
-              <w:rPr>
-                <w:b w:val="0"/>
-                <w:sz w:val="20"/>
-              </w:rPr>
-              <w:t>Report section 4 and counts.tex</w:t>
-            </w:r>
-          </w:p>
-        </w:tc>
-        <w:tc>
-          <w:tcPr>
-            <w:tcW w:type="dxa" w:w="2520"/>
-            <w:shd w:fill="F5F7F9"/>
-            <w:vAlign w:val="center"/>
-          </w:tcPr>
-          <w:p>
-            <w:pPr>
-              <w:spacing w:after="80"/>
-            </w:pPr>
-            <w:r>
-              <w:rPr>
-                <w:b w:val="0"/>
-                <w:sz w:val="20"/>
-              </w:rPr>
-              <w:t>Partly closed</w:t>
-            </w:r>
-          </w:p>
-        </w:tc>
-      </w:tr>
-      <w:tr>
-        <w:tc>
-          <w:tcPr>
-            <w:tcW w:type="dxa" w:w="504"/>
-            <w:vAlign w:val="center"/>
-          </w:tcPr>
-          <w:p>
-            <w:pPr>
-              <w:spacing w:after="80"/>
-            </w:pPr>
-            <w:r>
-              <w:rPr>
-                <w:b w:val="0"/>
-                <w:sz w:val="20"/>
-              </w:rPr>
-              <w:t>13</w:t>
-            </w:r>
-          </w:p>
-        </w:tc>
-        <w:tc>
-          <w:tcPr>
-            <w:tcW w:type="dxa" w:w="3024"/>
-            <w:vAlign w:val="center"/>
-          </w:tcPr>
-          <w:p>
-            <w:pPr>
-              <w:spacing w:after="80"/>
-            </w:pPr>
-            <w:r>
-              <w:rPr>
-                <w:b w:val="0"/>
-                <w:sz w:val="20"/>
-              </w:rPr>
-              <w:t>QA checklist and scores</w:t>
-            </w:r>
-          </w:p>
-        </w:tc>
-        <w:tc>
-          <w:tcPr>
-            <w:tcW w:type="dxa" w:w="3888"/>
-            <w:vAlign w:val="center"/>
-          </w:tcPr>
-          <w:p>
-            <w:pPr>
-              <w:spacing w:after="80"/>
-            </w:pPr>
-            <w:r>
-              <w:rPr>
-                <w:b w:val="0"/>
-                <w:sz w:val="20"/>
-              </w:rPr>
-              <w:t>Master QA and Final_Candidate_QA.csv</w:t>
-            </w:r>
-          </w:p>
-        </w:tc>
-        <w:tc>
-          <w:tcPr>
-            <w:tcW w:type="dxa" w:w="2520"/>
-            <w:vAlign w:val="center"/>
-          </w:tcPr>
-          <w:p>
-            <w:pPr>
-              <w:spacing w:after="80"/>
-            </w:pPr>
-            <w:r>
-              <w:rPr>
-                <w:b w:val="0"/>
-                <w:sz w:val="20"/>
-              </w:rPr>
-              <w:t>Source appraisals present</w:t>
-            </w:r>
-          </w:p>
-        </w:tc>
-      </w:tr>
-      <w:tr>
-        <w:tc>
-          <w:tcPr>
-            <w:tcW w:type="dxa" w:w="504"/>
-            <w:shd w:fill="F5F7F9"/>
-            <w:vAlign w:val="center"/>
-          </w:tcPr>
-          <w:p>
-            <w:pPr>
-              <w:spacing w:after="80"/>
-            </w:pPr>
-            <w:r>
-              <w:rPr>
-                <w:b w:val="0"/>
-                <w:sz w:val="20"/>
-              </w:rPr>
-              <w:t>14</w:t>
-            </w:r>
-          </w:p>
-        </w:tc>
-        <w:tc>
-          <w:tcPr>
-            <w:tcW w:type="dxa" w:w="3024"/>
-            <w:shd w:fill="F5F7F9"/>
-            <w:vAlign w:val="center"/>
-          </w:tcPr>
-          <w:p>
-            <w:pPr>
-              <w:spacing w:after="80"/>
-            </w:pPr>
-            <w:r>
-              <w:rPr>
-                <w:b w:val="0"/>
-                <w:sz w:val="20"/>
-              </w:rPr>
-              <w:t>Included primary studies</w:t>
-            </w:r>
-          </w:p>
-        </w:tc>
-        <w:tc>
-          <w:tcPr>
-            <w:tcW w:type="dxa" w:w="3888"/>
-            <w:shd w:fill="F5F7F9"/>
-            <w:vAlign w:val="center"/>
-          </w:tcPr>
-          <w:p>
-            <w:pPr>
-              <w:spacing w:after="80"/>
-            </w:pPr>
-            <w:r>
-              <w:rPr>
-                <w:b w:val="0"/>
-                <w:sz w:val="20"/>
-              </w:rPr>
-              <w:t>Master Studies and Source_Register.csv</w:t>
-            </w:r>
-          </w:p>
-        </w:tc>
-        <w:tc>
-          <w:tcPr>
-            <w:tcW w:type="dxa" w:w="2520"/>
-            <w:shd w:fill="F5F7F9"/>
-            <w:vAlign w:val="center"/>
-          </w:tcPr>
-          <w:p>
-            <w:pPr>
-              <w:spacing w:after="80"/>
-            </w:pPr>
-            <w:r>
-              <w:rPr>
-                <w:b w:val="0"/>
-                <w:sz w:val="20"/>
-              </w:rPr>
-              <w:t>Assessed set present</w:t>
-            </w:r>
-          </w:p>
-        </w:tc>
-      </w:tr>
-      <w:tr>
-        <w:tc>
-          <w:tcPr>
-            <w:tcW w:type="dxa" w:w="504"/>
-            <w:vAlign w:val="center"/>
-          </w:tcPr>
-          <w:p>
-            <w:pPr>
-              <w:spacing w:after="80"/>
-            </w:pPr>
-            <w:r>
-              <w:rPr>
-                <w:b w:val="0"/>
-                <w:sz w:val="20"/>
-              </w:rPr>
-              <w:t>15</w:t>
-            </w:r>
-          </w:p>
-        </w:tc>
-        <w:tc>
-          <w:tcPr>
-            <w:tcW w:type="dxa" w:w="3024"/>
-            <w:vAlign w:val="center"/>
-          </w:tcPr>
-          <w:p>
-            <w:pPr>
-              <w:spacing w:after="80"/>
-            </w:pPr>
-            <w:r>
-              <w:rPr>
-                <w:b w:val="0"/>
-                <w:sz w:val="20"/>
-              </w:rPr>
-              <w:t>Extraction sheet</w:t>
-            </w:r>
-          </w:p>
-        </w:tc>
-        <w:tc>
-          <w:tcPr>
-            <w:tcW w:type="dxa" w:w="3888"/>
-            <w:vAlign w:val="center"/>
-          </w:tcPr>
-          <w:p>
-            <w:pPr>
-              <w:spacing w:after="80"/>
-            </w:pPr>
-            <w:r>
-              <w:rPr>
-                <w:b w:val="0"/>
-                <w:sz w:val="20"/>
-              </w:rPr>
-              <w:t>Master Extraction and Evidence</w:t>
-            </w:r>
-          </w:p>
-        </w:tc>
-        <w:tc>
-          <w:tcPr>
-            <w:tcW w:type="dxa" w:w="2520"/>
-            <w:vAlign w:val="center"/>
-          </w:tcPr>
-          <w:p>
-            <w:pPr>
-              <w:spacing w:after="80"/>
-            </w:pPr>
-            <w:r>
-              <w:rPr>
-                <w:b w:val="0"/>
-                <w:sz w:val="20"/>
-              </w:rPr>
-              <w:t>Present</w:t>
-            </w:r>
-          </w:p>
-        </w:tc>
-      </w:tr>
-      <w:tr>
-        <w:tc>
-          <w:tcPr>
-            <w:tcW w:type="dxa" w:w="504"/>
-            <w:shd w:fill="F5F7F9"/>
-            <w:vAlign w:val="center"/>
-          </w:tcPr>
-          <w:p>
-            <w:pPr>
-              <w:spacing w:after="80"/>
-            </w:pPr>
-            <w:r>
-              <w:rPr>
-                <w:b w:val="0"/>
-                <w:sz w:val="20"/>
-              </w:rPr>
-              <w:t>16</w:t>
-            </w:r>
-          </w:p>
-        </w:tc>
-        <w:tc>
-          <w:tcPr>
-            <w:tcW w:type="dxa" w:w="3024"/>
-            <w:shd w:fill="F5F7F9"/>
-            <w:vAlign w:val="center"/>
-          </w:tcPr>
-          <w:p>
-            <w:pPr>
-              <w:spacing w:after="80"/>
-            </w:pPr>
-            <w:r>
-              <w:rPr>
-                <w:b w:val="0"/>
-                <w:sz w:val="20"/>
-              </w:rPr>
-              <w:t>Taxonomy</w:t>
-            </w:r>
-          </w:p>
-        </w:tc>
-        <w:tc>
-          <w:tcPr>
-            <w:tcW w:type="dxa" w:w="3888"/>
-            <w:shd w:fill="F5F7F9"/>
-            <w:vAlign w:val="center"/>
-          </w:tcPr>
-          <w:p>
-            <w:pPr>
-              <w:spacing w:after="80"/>
-            </w:pPr>
-            <w:r>
-              <w:rPr>
-                <w:b w:val="0"/>
-                <w:sz w:val="20"/>
-              </w:rPr>
-              <w:t>Report section 5 and Taxonomy.csv</w:t>
-            </w:r>
-          </w:p>
-        </w:tc>
-        <w:tc>
-          <w:tcPr>
-            <w:tcW w:type="dxa" w:w="2520"/>
-            <w:shd w:fill="F5F7F9"/>
-            <w:vAlign w:val="center"/>
-          </w:tcPr>
-          <w:p>
-            <w:pPr>
-              <w:spacing w:after="80"/>
-            </w:pPr>
-            <w:r>
-              <w:rPr>
-                <w:b w:val="0"/>
-                <w:sz w:val="20"/>
-              </w:rPr>
-              <w:t>Present</w:t>
-            </w:r>
-          </w:p>
-        </w:tc>
-      </w:tr>
-      <w:tr>
-        <w:tc>
-          <w:tcPr>
-            <w:tcW w:type="dxa" w:w="504"/>
-            <w:vAlign w:val="center"/>
-          </w:tcPr>
-          <w:p>
-            <w:pPr>
-              <w:spacing w:after="80"/>
-            </w:pPr>
-            <w:r>
-              <w:rPr>
-                <w:b w:val="0"/>
-                <w:sz w:val="20"/>
-              </w:rPr>
-              <w:t>17</w:t>
-            </w:r>
-          </w:p>
-        </w:tc>
-        <w:tc>
-          <w:tcPr>
-            <w:tcW w:type="dxa" w:w="3024"/>
-            <w:vAlign w:val="center"/>
-          </w:tcPr>
-          <w:p>
-            <w:pPr>
-              <w:spacing w:after="80"/>
-            </w:pPr>
-            <w:r>
-              <w:rPr>
-                <w:b w:val="0"/>
-                <w:sz w:val="20"/>
-              </w:rPr>
-              <w:t>Comparative evidence matrix</w:t>
-            </w:r>
-          </w:p>
-        </w:tc>
-        <w:tc>
-          <w:tcPr>
-            <w:tcW w:type="dxa" w:w="3888"/>
-            <w:vAlign w:val="center"/>
-          </w:tcPr>
-          <w:p>
-            <w:pPr>
-              <w:spacing w:after="80"/>
-            </w:pPr>
-            <w:r>
-              <w:rPr>
-                <w:b w:val="0"/>
-                <w:sz w:val="20"/>
-              </w:rPr>
-              <w:t>Report section 7 and Comparability.csv</w:t>
-            </w:r>
-          </w:p>
-        </w:tc>
-        <w:tc>
-          <w:tcPr>
-            <w:tcW w:type="dxa" w:w="2520"/>
-            <w:vAlign w:val="center"/>
-          </w:tcPr>
-          <w:p>
-            <w:pPr>
-              <w:spacing w:after="80"/>
-            </w:pPr>
-            <w:r>
-              <w:rPr>
-                <w:b w:val="0"/>
-                <w:sz w:val="20"/>
-              </w:rPr>
-              <w:t>Present</w:t>
-            </w:r>
-          </w:p>
-        </w:tc>
-      </w:tr>
-      <w:tr>
-        <w:tc>
-          <w:tcPr>
-            <w:tcW w:type="dxa" w:w="504"/>
-            <w:shd w:fill="F5F7F9"/>
-            <w:vAlign w:val="center"/>
-          </w:tcPr>
-          <w:p>
-            <w:pPr>
-              <w:spacing w:after="80"/>
-            </w:pPr>
-            <w:r>
-              <w:rPr>
-                <w:b w:val="0"/>
-                <w:sz w:val="20"/>
-              </w:rPr>
-              <w:t>18</w:t>
-            </w:r>
-          </w:p>
-        </w:tc>
-        <w:tc>
-          <w:tcPr>
-            <w:tcW w:type="dxa" w:w="3024"/>
-            <w:shd w:fill="F5F7F9"/>
-            <w:vAlign w:val="center"/>
-          </w:tcPr>
-          <w:p>
-            <w:pPr>
-              <w:spacing w:after="80"/>
-            </w:pPr>
-            <w:r>
-              <w:rPr>
-                <w:b w:val="0"/>
-                <w:sz w:val="20"/>
-              </w:rPr>
-              <w:t>Engineering trade offs</w:t>
-            </w:r>
-          </w:p>
-        </w:tc>
-        <w:tc>
-          <w:tcPr>
-            <w:tcW w:type="dxa" w:w="3888"/>
-            <w:shd w:fill="F5F7F9"/>
-            <w:vAlign w:val="center"/>
-          </w:tcPr>
-          <w:p>
-            <w:pPr>
-              <w:spacing w:after="80"/>
-            </w:pPr>
-            <w:r>
-              <w:rPr>
-                <w:b w:val="0"/>
-                <w:sz w:val="20"/>
-              </w:rPr>
-              <w:t>Report section 8</w:t>
-            </w:r>
-          </w:p>
-        </w:tc>
-        <w:tc>
-          <w:tcPr>
-            <w:tcW w:type="dxa" w:w="2520"/>
-            <w:shd w:fill="F5F7F9"/>
-            <w:vAlign w:val="center"/>
-          </w:tcPr>
-          <w:p>
-            <w:pPr>
-              <w:spacing w:after="80"/>
-            </w:pPr>
-            <w:r>
-              <w:rPr>
-                <w:b w:val="0"/>
-                <w:sz w:val="20"/>
-              </w:rPr>
-              <w:t>Present</w:t>
-            </w:r>
-          </w:p>
-        </w:tc>
-      </w:tr>
-      <w:tr>
-        <w:tc>
-          <w:tcPr>
-            <w:tcW w:type="dxa" w:w="504"/>
-            <w:vAlign w:val="center"/>
-          </w:tcPr>
-          <w:p>
-            <w:pPr>
-              <w:spacing w:after="80"/>
-            </w:pPr>
-            <w:r>
-              <w:rPr>
-                <w:b w:val="0"/>
-                <w:sz w:val="20"/>
-              </w:rPr>
-              <w:t>19</w:t>
-            </w:r>
-          </w:p>
-        </w:tc>
-        <w:tc>
-          <w:tcPr>
-            <w:tcW w:type="dxa" w:w="3024"/>
-            <w:vAlign w:val="center"/>
-          </w:tcPr>
-          <w:p>
-            <w:pPr>
-              <w:spacing w:after="80"/>
-            </w:pPr>
-            <w:r>
-              <w:rPr>
-                <w:b w:val="0"/>
-                <w:sz w:val="20"/>
-              </w:rPr>
-              <w:t>Conflicting evidence</w:t>
-            </w:r>
-          </w:p>
-        </w:tc>
-        <w:tc>
-          <w:tcPr>
-            <w:tcW w:type="dxa" w:w="3888"/>
-            <w:vAlign w:val="center"/>
-          </w:tcPr>
-          <w:p>
-            <w:pPr>
-              <w:spacing w:after="80"/>
-            </w:pPr>
-            <w:r>
-              <w:rPr>
-                <w:b w:val="0"/>
-                <w:sz w:val="20"/>
-              </w:rPr>
-              <w:t>Report section 9 and comparison tables</w:t>
-            </w:r>
-          </w:p>
-        </w:tc>
-        <w:tc>
-          <w:tcPr>
-            <w:tcW w:type="dxa" w:w="2520"/>
-            <w:vAlign w:val="center"/>
-          </w:tcPr>
-          <w:p>
-            <w:pPr>
-              <w:spacing w:after="80"/>
-            </w:pPr>
-            <w:r>
-              <w:rPr>
-                <w:b w:val="0"/>
-                <w:sz w:val="20"/>
-              </w:rPr>
-              <w:t>Present</w:t>
-            </w:r>
-          </w:p>
-        </w:tc>
-      </w:tr>
-      <w:tr>
-        <w:tc>
-          <w:tcPr>
-            <w:tcW w:type="dxa" w:w="504"/>
-            <w:shd w:fill="F5F7F9"/>
-            <w:vAlign w:val="center"/>
-          </w:tcPr>
-          <w:p>
-            <w:pPr>
-              <w:spacing w:after="80"/>
-            </w:pPr>
-            <w:r>
-              <w:rPr>
-                <w:b w:val="0"/>
-                <w:sz w:val="20"/>
-              </w:rPr>
-              <w:t>20</w:t>
-            </w:r>
-          </w:p>
-        </w:tc>
-        <w:tc>
-          <w:tcPr>
-            <w:tcW w:type="dxa" w:w="3024"/>
-            <w:shd w:fill="F5F7F9"/>
-            <w:vAlign w:val="center"/>
-          </w:tcPr>
-          <w:p>
-            <w:pPr>
-              <w:spacing w:after="80"/>
-            </w:pPr>
-            <w:r>
-              <w:rPr>
-                <w:b w:val="0"/>
-                <w:sz w:val="20"/>
-              </w:rPr>
-              <w:t>Answers to all RQs</w:t>
-            </w:r>
-          </w:p>
-        </w:tc>
-        <w:tc>
-          <w:tcPr>
-            <w:tcW w:type="dxa" w:w="3888"/>
-            <w:shd w:fill="F5F7F9"/>
-            <w:vAlign w:val="center"/>
-          </w:tcPr>
-          <w:p>
-            <w:pPr>
-              <w:spacing w:after="80"/>
-            </w:pPr>
-            <w:r>
-              <w:rPr>
-                <w:b w:val="0"/>
-                <w:sz w:val="20"/>
-              </w:rPr>
-              <w:t>Report section 6</w:t>
-            </w:r>
-          </w:p>
-        </w:tc>
-        <w:tc>
-          <w:tcPr>
-            <w:tcW w:type="dxa" w:w="2520"/>
-            <w:shd w:fill="F5F7F9"/>
-            <w:vAlign w:val="center"/>
-          </w:tcPr>
-          <w:p>
-            <w:pPr>
-              <w:spacing w:after="80"/>
-            </w:pPr>
-            <w:r>
-              <w:rPr>
-                <w:b w:val="0"/>
-                <w:sz w:val="20"/>
-              </w:rPr>
-              <w:t>Present</w:t>
-            </w:r>
-          </w:p>
-        </w:tc>
-      </w:tr>
-      <w:tr>
-        <w:tc>
-          <w:tcPr>
-            <w:tcW w:type="dxa" w:w="504"/>
-            <w:vAlign w:val="center"/>
-          </w:tcPr>
-          <w:p>
-            <w:pPr>
-              <w:spacing w:after="80"/>
-            </w:pPr>
-            <w:r>
-              <w:rPr>
-                <w:b w:val="0"/>
-                <w:sz w:val="20"/>
-              </w:rPr>
-              <w:t>21</w:t>
-            </w:r>
-          </w:p>
-        </w:tc>
-        <w:tc>
-          <w:tcPr>
-            <w:tcW w:type="dxa" w:w="3024"/>
-            <w:vAlign w:val="center"/>
-          </w:tcPr>
-          <w:p>
-            <w:pPr>
-              <w:spacing w:after="80"/>
-            </w:pPr>
-            <w:r>
-              <w:rPr>
-                <w:b w:val="0"/>
-                <w:sz w:val="20"/>
-              </w:rPr>
-              <w:t>Engineering recommendation</w:t>
-            </w:r>
-          </w:p>
-        </w:tc>
-        <w:tc>
-          <w:tcPr>
-            <w:tcW w:type="dxa" w:w="3888"/>
-            <w:vAlign w:val="center"/>
-          </w:tcPr>
-          <w:p>
-            <w:pPr>
-              <w:spacing w:after="80"/>
-            </w:pPr>
-            <w:r>
-              <w:rPr>
-                <w:b w:val="0"/>
-                <w:sz w:val="20"/>
-              </w:rPr>
-              <w:t>Report section 10 and Recommendations.csv</w:t>
-            </w:r>
-          </w:p>
-        </w:tc>
-        <w:tc>
-          <w:tcPr>
-            <w:tcW w:type="dxa" w:w="2520"/>
-            <w:vAlign w:val="center"/>
-          </w:tcPr>
-          <w:p>
-            <w:pPr>
-              <w:spacing w:after="80"/>
-            </w:pPr>
-            <w:r>
-              <w:rPr>
-                <w:b w:val="0"/>
-                <w:sz w:val="20"/>
-              </w:rPr>
-              <w:t>Present</w:t>
-            </w:r>
-          </w:p>
-        </w:tc>
-      </w:tr>
-      <w:tr>
-        <w:tc>
-          <w:tcPr>
-            <w:tcW w:type="dxa" w:w="504"/>
-            <w:shd w:fill="F5F7F9"/>
-            <w:vAlign w:val="center"/>
-          </w:tcPr>
-          <w:p>
-            <w:pPr>
-              <w:spacing w:after="80"/>
-            </w:pPr>
-            <w:r>
-              <w:rPr>
-                <w:b w:val="0"/>
-                <w:sz w:val="20"/>
-              </w:rPr>
-              <w:t>22</w:t>
-            </w:r>
-          </w:p>
-        </w:tc>
-        <w:tc>
-          <w:tcPr>
-            <w:tcW w:type="dxa" w:w="3024"/>
-            <w:shd w:fill="F5F7F9"/>
-            <w:vAlign w:val="center"/>
-          </w:tcPr>
-          <w:p>
-            <w:pPr>
-              <w:spacing w:after="80"/>
-            </w:pPr>
-            <w:r>
-              <w:rPr>
-                <w:b w:val="0"/>
-                <w:sz w:val="20"/>
-              </w:rPr>
-              <w:t>Research gaps</w:t>
-            </w:r>
-          </w:p>
-        </w:tc>
-        <w:tc>
-          <w:tcPr>
-            <w:tcW w:type="dxa" w:w="3888"/>
-            <w:shd w:fill="F5F7F9"/>
-            <w:vAlign w:val="center"/>
-          </w:tcPr>
-          <w:p>
-            <w:pPr>
-              <w:spacing w:after="80"/>
-            </w:pPr>
-            <w:r>
-              <w:rPr>
-                <w:b w:val="0"/>
-                <w:sz w:val="20"/>
-              </w:rPr>
-              <w:t>Report section 11 and Research_Gaps.csv</w:t>
-            </w:r>
-          </w:p>
-        </w:tc>
-        <w:tc>
-          <w:tcPr>
-            <w:tcW w:type="dxa" w:w="2520"/>
-            <w:shd w:fill="F5F7F9"/>
-            <w:vAlign w:val="center"/>
-          </w:tcPr>
-          <w:p>
-            <w:pPr>
-              <w:spacing w:after="80"/>
-            </w:pPr>
-            <w:r>
-              <w:rPr>
-                <w:b w:val="0"/>
-                <w:sz w:val="20"/>
-              </w:rPr>
-              <w:t>Present</w:t>
-            </w:r>
-          </w:p>
-        </w:tc>
-      </w:tr>
-      <w:tr>
-        <w:tc>
-          <w:tcPr>
-            <w:tcW w:type="dxa" w:w="504"/>
-            <w:vAlign w:val="center"/>
-          </w:tcPr>
-          <w:p>
-            <w:pPr>
-              <w:spacing w:after="80"/>
-            </w:pPr>
-            <w:r>
-              <w:rPr>
-                <w:b w:val="0"/>
-                <w:sz w:val="20"/>
-              </w:rPr>
-              <w:t>23</w:t>
-            </w:r>
-          </w:p>
-        </w:tc>
-        <w:tc>
-          <w:tcPr>
-            <w:tcW w:type="dxa" w:w="3024"/>
-            <w:vAlign w:val="center"/>
-          </w:tcPr>
-          <w:p>
-            <w:pPr>
-              <w:spacing w:after="80"/>
-            </w:pPr>
-            <w:r>
-              <w:rPr>
-                <w:b w:val="0"/>
-                <w:sz w:val="20"/>
-              </w:rPr>
-              <w:t>Threats to validity</w:t>
-            </w:r>
-          </w:p>
-        </w:tc>
-        <w:tc>
-          <w:tcPr>
-            <w:tcW w:type="dxa" w:w="3888"/>
-            <w:vAlign w:val="center"/>
-          </w:tcPr>
-          <w:p>
-            <w:pPr>
-              <w:spacing w:after="80"/>
-            </w:pPr>
-            <w:r>
-              <w:rPr>
-                <w:b w:val="0"/>
-                <w:sz w:val="20"/>
-              </w:rPr>
-              <w:t>Report section 12 and Validity.csv</w:t>
-            </w:r>
-          </w:p>
-        </w:tc>
-        <w:tc>
-          <w:tcPr>
-            <w:tcW w:type="dxa" w:w="2520"/>
-            <w:vAlign w:val="center"/>
-          </w:tcPr>
-          <w:p>
-            <w:pPr>
-              <w:spacing w:after="80"/>
-            </w:pPr>
-            <w:r>
-              <w:rPr>
-                <w:b w:val="0"/>
-                <w:sz w:val="20"/>
-              </w:rPr>
-              <w:t>Present</w:t>
-            </w:r>
-          </w:p>
-        </w:tc>
-      </w:tr>
-      <w:tr>
-        <w:tc>
-          <w:tcPr>
-            <w:tcW w:type="dxa" w:w="504"/>
-            <w:shd w:fill="F5F7F9"/>
-            <w:vAlign w:val="center"/>
-          </w:tcPr>
-          <w:p>
-            <w:pPr>
-              <w:spacing w:after="80"/>
-            </w:pPr>
-            <w:r>
-              <w:rPr>
-                <w:b w:val="0"/>
-                <w:sz w:val="20"/>
-              </w:rPr>
-              <w:t>24</w:t>
-            </w:r>
-          </w:p>
-        </w:tc>
-        <w:tc>
-          <w:tcPr>
-            <w:tcW w:type="dxa" w:w="3024"/>
-            <w:shd w:fill="F5F7F9"/>
-            <w:vAlign w:val="center"/>
-          </w:tcPr>
-          <w:p>
-            <w:pPr>
-              <w:spacing w:after="80"/>
-            </w:pPr>
-            <w:r>
-              <w:rPr>
-                <w:b w:val="0"/>
-                <w:sz w:val="20"/>
-              </w:rPr>
-              <w:t>Complete references</w:t>
-            </w:r>
-          </w:p>
-        </w:tc>
-        <w:tc>
-          <w:tcPr>
-            <w:tcW w:type="dxa" w:w="3888"/>
-            <w:shd w:fill="F5F7F9"/>
-            <w:vAlign w:val="center"/>
-          </w:tcPr>
-          <w:p>
-            <w:pPr>
-              <w:spacing w:after="80"/>
-            </w:pPr>
-            <w:r>
-              <w:rPr>
-                <w:b w:val="0"/>
-                <w:sz w:val="20"/>
-              </w:rPr>
-              <w:t>Report references and references.bib</w:t>
-            </w:r>
-          </w:p>
-        </w:tc>
-        <w:tc>
-          <w:tcPr>
-            <w:tcW w:type="dxa" w:w="2520"/>
-            <w:shd w:fill="F5F7F9"/>
-            <w:vAlign w:val="center"/>
-          </w:tcPr>
-          <w:p>
-            <w:pPr>
-              <w:spacing w:after="80"/>
-            </w:pPr>
-            <w:r>
-              <w:rPr>
-                <w:b w:val="0"/>
-                <w:sz w:val="20"/>
-              </w:rPr>
-              <w:t>Present with version limits</w:t>
-            </w:r>
-          </w:p>
-        </w:tc>
-      </w:tr>
-      <w:tr>
-        <w:tc>
-          <w:tcPr>
-            <w:tcW w:type="dxa" w:w="504"/>
-            <w:vAlign w:val="center"/>
-          </w:tcPr>
-          <w:p>
-            <w:pPr>
-              <w:spacing w:after="80"/>
-            </w:pPr>
-            <w:r>
-              <w:rPr>
-                <w:b w:val="0"/>
-                <w:sz w:val="20"/>
-              </w:rPr>
-              <w:t>25</w:t>
-            </w:r>
-          </w:p>
-        </w:tc>
-        <w:tc>
-          <w:tcPr>
-            <w:tcW w:type="dxa" w:w="3024"/>
-            <w:vAlign w:val="center"/>
-          </w:tcPr>
-          <w:p>
-            <w:pPr>
-              <w:spacing w:after="80"/>
-            </w:pPr>
-            <w:r>
-              <w:rPr>
-                <w:b w:val="0"/>
-                <w:sz w:val="20"/>
-              </w:rPr>
-              <w:t>Supporting verification files</w:t>
-            </w:r>
-          </w:p>
-        </w:tc>
-        <w:tc>
-          <w:tcPr>
-            <w:tcW w:type="dxa" w:w="3888"/>
-            <w:vAlign w:val="center"/>
-          </w:tcPr>
-          <w:p>
-            <w:pPr>
-              <w:spacing w:after="80"/>
-            </w:pPr>
-            <w:r>
-              <w:rPr>
-                <w:b w:val="0"/>
-                <w:sz w:val="20"/>
-              </w:rPr>
-              <w:t>03_Data_and_Logs and repository history</w:t>
-            </w:r>
-          </w:p>
-        </w:tc>
-        <w:tc>
-          <w:tcPr>
-            <w:tcW w:type="dxa" w:w="2520"/>
-            <w:vAlign w:val="center"/>
-          </w:tcPr>
-          <w:p>
-            <w:pPr>
-              <w:spacing w:after="80"/>
-            </w:pPr>
-            <w:r>
-              <w:rPr>
-                <w:b w:val="0"/>
-                <w:sz w:val="20"/>
-              </w:rPr>
-              <w:t>Present with limits</w:t>
-            </w:r>
-          </w:p>
-        </w:tc>
-      </w:tr>
-    </w:tbl>
-    <w:p>
-      <w:pPr>
-        <w:pStyle w:val="Heading1"/>
-      </w:pPr>
-      <w:r>
-        <w:t>How headings 24 to 27 apply</w:t>
-      </w:r>
-    </w:p>
-    <w:p>
-      <w:r>
-        <w:t>Heading 24 is the report structure. The current report has all thirteen main sections: Introduction; Research Questions; Methodology; Study Selection; Taxonomy; Results by RQ; Comparison; Trade-offs; Discussion; Recommendation; Research Gaps; Validity; Conclusion. References and evidence appendices follow. The appendix paper cards support the synthesis; they do not replace analysis across papers.</w:t>
-      </w:r>
-    </w:p>
-    <w:p>
-      <w:r>
-        <w:t>Heading 25 asks for critical analysis. For each recommendation, explain which mechanism fits which workload, what evidence supports it and what cost must be accepted. Do not rank unrelated percentages as though the papers used one experiment. Mean latency, p99, batch completion, block dispersion and throughput sum remain distinct.</w:t>
-      </w:r>
-    </w:p>
-    <w:p>
-      <w:r>
-        <w:t>Heading 26 asks for traceability and reproducibility. Every included study needs an identifiable source, every decision needs evidence, and every PRISMA count needs a real log. The current source/QA/extraction records are present. The 320 deferred records and historical search gaps mean that full compliance is still incomplete. They must remain visible.</w:t>
-      </w:r>
-    </w:p>
-    <w:p>
-      <w:r>
-        <w:t>Heading 27 is the final engineering answer. Read the recommendation section and ask: what should an engineer select, under which conditions, why, with which benefit and sacrifice, and when is an alternative preferable? Every answer must point back to the reviewed evidence.</w:t>
-      </w:r>
-    </w:p>
-    <w:p>
-      <w:pPr>
-        <w:pStyle w:val="Heading1"/>
-      </w:pPr>
-      <w:r>
-        <w:t>Work before Sunday submission</w:t>
-      </w:r>
-    </w:p>
-    <w:p>
-      <w:r>
-        <w:t>1. Start with this current package and transfer any older corrections by paper ID.</w:t>
-      </w:r>
-    </w:p>
-    <w:p>
-      <w:r>
-        <w:t>2. Eshaal and Rameen check their assigned sources and the report sections above. Return concrete corrections, not a blanket approval.</w:t>
-      </w:r>
-    </w:p>
-    <w:p>
-      <w:r>
-        <w:t>3. Raazia reconciles corrections, regenerates affected outputs and checks the final report against the guideline matrix.</w:t>
-      </w:r>
-    </w:p>
-    <w:p>
-      <w:r>
-        <w:t>4. Keep the 320-record queue separate. If further records are actually assessed, apply the criteria and rebuild the corpus-dependent outputs. Do not mark that queue complete merely because the draft minimum is met.</w:t>
-      </w:r>
-    </w:p>
-    <w:p>
-      <w:r>
-        <w:t>5. Confirm cover details, submission instructions, required individual submissions and file opening. Record the exact final version before sending it to Sir.</w:t>
-      </w:r>
-    </w:p>
-    <w:p>
-      <w:r>
-        <w:t>The current draft can be reviewed as a bounded first draft. Approval cannot be guaranteed, particularly while systematic selection and historical search reconstruction remain incomplete. The most useful work now is genuine source checking and correction of substantive claims, followed by a single consistent submission version.</w:t>
+        <w:t>The current draft is assembled; the entire SLR is incomplete. 318 advanced candidates still need identity/version and eligibility decisions. Of the original 320 open cases, 82 had indexed PDF routes attempted this cycle; 34 PDFs were recovered and two records were excluded after source assessment. The remaining 318 comprise 32 recovered texts awaiting decisions, 48 cases without a recovered PDF from those routes, and 238 cases needing further source discovery. These categories do not justify automatic exclusions. The separate access log records the attempts. Genuine independent checking and historical search/PRISMA reconciliation also remain.</w:t>
       </w:r>
     </w:p>
     <w:sectPr>
-      <w:footerReference w:type="default" r:id="rId9"/>
       <w:pgSz w:w="12240" w:h="15840"/>
-      <w:pgMar w:top="1008" w:right="1080" w:bottom="1008" w:left="1080" w:header="720" w:footer="720" w:gutter="0"/>
+      <w:pgMar w:top="864" w:right="936" w:bottom="864" w:left="936" w:header="720" w:footer="720" w:gutter="0"/>
       <w:cols w:space="720"/>
       <w:docGrid w:linePitch="360"/>
     </w:sectPr>
   </w:body>
 </w:document>
-</file>
-
-<file path=word/footer1.xml><?xml version="1.0" encoding="utf-8"?>
-<w:ftr xmlns:m="http://schemas.openxmlformats.org/officeDocument/2006/math" xmlns:mc="http://schemas.openxmlformats.org/markup-compatibility/2006" xmlns:mo="http://schemas.microsoft.com/office/mac/office/2008/main" xmlns:mv="urn:schemas-microsoft-com:mac:vml" xmlns:o="urn:schemas-microsoft-com:office:office" xmlns:r="http://schemas.openxmlformats.org/officeDocument/2006/relationships" xmlns:v="urn:schemas-microsoft-com:vml" xmlns:w10="urn:schemas-microsoft-com:office:word" xmlns:w14="http://schemas.microsoft.com/office/word/2010/wordml" xmlns:w="http://schemas.openxmlformats.org/wordprocessingml/2006/main" xmlns:wne="http://schemas.microsoft.com/office/word/2006/wordml" xmlns:wp14="http://schemas.microsoft.com/office/word/2010/wordprocessingDrawing" xmlns:wp="http://schemas.openxmlformats.org/drawingml/2006/wordprocessingDrawing" xmlns:wpc="http://schemas.microsoft.com/office/word/2010/wordprocessingCanvas" xmlns:wpg="http://schemas.microsoft.com/office/word/2010/wordprocessingGroup" xmlns:wpi="http://schemas.microsoft.com/office/word/2010/wordprocessingInk" xmlns:wps="http://schemas.microsoft.com/office/word/2010/wordprocessingShape" mc:Ignorable="w14 wp14">
-  <w:p>
-    <w:pPr>
-      <w:pStyle w:val="Footer"/>
-      <w:jc w:val="center"/>
-    </w:pPr>
-    <w:fldSimple w:instr="PAGE"/>
-  </w:p>
-</w:ftr>
 </file>
 
 <file path=word/numbering.xml><?xml version="1.0" encoding="utf-8"?>
@@ -4300,12 +471,12 @@
     <w:qFormat/>
     <w:rsid w:val="00FC693F"/>
     <w:pPr>
-      <w:spacing w:after="120" w:line="252" w:lineRule="auto"/>
+      <w:spacing w:after="80"/>
     </w:pPr>
     <w:rPr>
-      <w:rFonts w:ascii="Arial" w:hAnsi="Arial"/>
+      <w:rFonts w:ascii="Calibri" w:hAnsi="Calibri"/>
       <w:color w:val="000000"/>
-      <w:sz w:val="22"/>
+      <w:sz w:val="20"/>
     </w:rPr>
   </w:style>
   <w:style w:type="paragraph" w:styleId="Header">
@@ -4320,13 +491,8 @@
         <w:tab w:val="center" w:pos="4680"/>
         <w:tab w:val="right" w:pos="9360"/>
       </w:tabs>
-      <w:spacing w:after="120" w:line="252" w:lineRule="auto"/>
-    </w:pPr>
-    <w:rPr>
-      <w:rFonts w:ascii="Arial" w:hAnsi="Arial"/>
-      <w:color w:val="000000"/>
-      <w:sz w:val="22"/>
-    </w:rPr>
+      <w:spacing w:after="0" w:line="240" w:lineRule="auto"/>
+    </w:pPr>
   </w:style>
   <w:style w:type="character" w:customStyle="1" w:styleId="HeaderChar">
     <w:name w:val="Header Char"/>
@@ -4347,13 +513,8 @@
         <w:tab w:val="center" w:pos="4680"/>
         <w:tab w:val="right" w:pos="9360"/>
       </w:tabs>
-      <w:spacing w:after="120" w:line="252" w:lineRule="auto"/>
-    </w:pPr>
-    <w:rPr>
-      <w:rFonts w:ascii="Arial" w:hAnsi="Arial"/>
-      <w:color w:val="000000"/>
-      <w:sz w:val="22"/>
-    </w:rPr>
+      <w:spacing w:after="0" w:line="240" w:lineRule="auto"/>
+    </w:pPr>
   </w:style>
   <w:style w:type="character" w:customStyle="1" w:styleId="FooterChar">
     <w:name w:val="Footer Char"/>
@@ -4373,15 +534,15 @@
     <w:pPr>
       <w:keepNext/>
       <w:keepLines/>
-      <w:spacing w:before="480" w:after="120" w:line="252" w:lineRule="auto"/>
+      <w:spacing w:before="160" w:after="80"/>
       <w:outlineLvl w:val="0"/>
     </w:pPr>
     <w:rPr>
-      <w:rFonts w:asciiTheme="majorHAnsi" w:eastAsiaTheme="majorEastAsia" w:hAnsiTheme="majorHAnsi" w:cstheme="majorBidi" w:ascii="Arial" w:hAnsi="Arial"/>
+      <w:rFonts w:asciiTheme="majorHAnsi" w:eastAsiaTheme="majorEastAsia" w:hAnsiTheme="majorHAnsi" w:cstheme="majorBidi" w:ascii="Calibri" w:hAnsi="Calibri"/>
       <w:b/>
       <w:bCs/>
       <w:color w:val="000000"/>
-      <w:sz w:val="32"/>
+      <w:sz w:val="24"/>
       <w:szCs w:val="28"/>
     </w:rPr>
   </w:style>
@@ -4397,11 +558,11 @@
     <w:pPr>
       <w:keepNext/>
       <w:keepLines/>
-      <w:spacing w:before="200" w:after="120" w:line="252" w:lineRule="auto"/>
+      <w:spacing w:before="200" w:after="0"/>
       <w:outlineLvl w:val="1"/>
     </w:pPr>
     <w:rPr>
-      <w:rFonts w:asciiTheme="majorHAnsi" w:eastAsiaTheme="majorEastAsia" w:hAnsiTheme="majorHAnsi" w:cstheme="majorBidi" w:ascii="Arial" w:hAnsi="Arial"/>
+      <w:rFonts w:asciiTheme="majorHAnsi" w:eastAsiaTheme="majorEastAsia" w:hAnsiTheme="majorHAnsi" w:cstheme="majorBidi" w:ascii="Calibri" w:hAnsi="Calibri"/>
       <w:b/>
       <w:bCs/>
       <w:color w:val="000000"/>
@@ -4421,15 +582,14 @@
     <w:pPr>
       <w:keepNext/>
       <w:keepLines/>
-      <w:spacing w:before="200" w:after="120" w:line="252" w:lineRule="auto"/>
+      <w:spacing w:before="200" w:after="0"/>
       <w:outlineLvl w:val="2"/>
     </w:pPr>
     <w:rPr>
-      <w:rFonts w:asciiTheme="majorHAnsi" w:eastAsiaTheme="majorEastAsia" w:hAnsiTheme="majorHAnsi" w:cstheme="majorBidi" w:ascii="Arial" w:hAnsi="Arial"/>
+      <w:rFonts w:asciiTheme="majorHAnsi" w:eastAsiaTheme="majorEastAsia" w:hAnsiTheme="majorHAnsi" w:cstheme="majorBidi"/>
       <w:b/>
       <w:bCs/>
-      <w:color w:val="000000"/>
-      <w:sz w:val="22"/>
+      <w:color w:val="4F81BD" w:themeColor="accent1"/>
     </w:rPr>
   </w:style>
   <w:style w:type="paragraph" w:styleId="Heading4">
@@ -4445,17 +605,16 @@
     <w:pPr>
       <w:keepNext/>
       <w:keepLines/>
-      <w:spacing w:before="200" w:after="120" w:line="252" w:lineRule="auto"/>
+      <w:spacing w:before="200" w:after="0"/>
       <w:outlineLvl w:val="3"/>
     </w:pPr>
     <w:rPr>
-      <w:rFonts w:asciiTheme="majorHAnsi" w:eastAsiaTheme="majorEastAsia" w:hAnsiTheme="majorHAnsi" w:cstheme="majorBidi" w:ascii="Arial" w:hAnsi="Arial"/>
+      <w:rFonts w:asciiTheme="majorHAnsi" w:eastAsiaTheme="majorEastAsia" w:hAnsiTheme="majorHAnsi" w:cstheme="majorBidi"/>
       <w:b/>
       <w:bCs/>
       <w:i/>
       <w:iCs/>
-      <w:color w:val="000000"/>
-      <w:sz w:val="22"/>
+      <w:color w:val="4F81BD" w:themeColor="accent1"/>
     </w:rPr>
   </w:style>
   <w:style w:type="paragraph" w:styleId="Heading5">
@@ -4471,13 +630,12 @@
     <w:pPr>
       <w:keepNext/>
       <w:keepLines/>
-      <w:spacing w:before="200" w:after="120" w:line="252" w:lineRule="auto"/>
+      <w:spacing w:before="200" w:after="0"/>
       <w:outlineLvl w:val="4"/>
     </w:pPr>
     <w:rPr>
-      <w:rFonts w:asciiTheme="majorHAnsi" w:eastAsiaTheme="majorEastAsia" w:hAnsiTheme="majorHAnsi" w:cstheme="majorBidi" w:ascii="Arial" w:hAnsi="Arial"/>
-      <w:color w:val="000000"/>
-      <w:sz w:val="22"/>
+      <w:rFonts w:asciiTheme="majorHAnsi" w:eastAsiaTheme="majorEastAsia" w:hAnsiTheme="majorHAnsi" w:cstheme="majorBidi"/>
+      <w:color w:val="243F60" w:themeColor="accent1" w:themeShade="7F"/>
     </w:rPr>
   </w:style>
   <w:style w:type="paragraph" w:styleId="Heading6">
@@ -4493,15 +651,14 @@
     <w:pPr>
       <w:keepNext/>
       <w:keepLines/>
-      <w:spacing w:before="200" w:after="120" w:line="252" w:lineRule="auto"/>
+      <w:spacing w:before="200" w:after="0"/>
       <w:outlineLvl w:val="5"/>
     </w:pPr>
     <w:rPr>
-      <w:rFonts w:asciiTheme="majorHAnsi" w:eastAsiaTheme="majorEastAsia" w:hAnsiTheme="majorHAnsi" w:cstheme="majorBidi" w:ascii="Arial" w:hAnsi="Arial"/>
+      <w:rFonts w:asciiTheme="majorHAnsi" w:eastAsiaTheme="majorEastAsia" w:hAnsiTheme="majorHAnsi" w:cstheme="majorBidi"/>
       <w:i/>
       <w:iCs/>
-      <w:color w:val="000000"/>
-      <w:sz w:val="22"/>
+      <w:color w:val="243F60" w:themeColor="accent1" w:themeShade="7F"/>
     </w:rPr>
   </w:style>
   <w:style w:type="paragraph" w:styleId="Heading7">
@@ -4517,15 +674,14 @@
     <w:pPr>
       <w:keepNext/>
       <w:keepLines/>
-      <w:spacing w:before="200" w:after="120" w:line="252" w:lineRule="auto"/>
+      <w:spacing w:before="200" w:after="0"/>
       <w:outlineLvl w:val="6"/>
     </w:pPr>
     <w:rPr>
-      <w:rFonts w:asciiTheme="majorHAnsi" w:eastAsiaTheme="majorEastAsia" w:hAnsiTheme="majorHAnsi" w:cstheme="majorBidi" w:ascii="Arial" w:hAnsi="Arial"/>
+      <w:rFonts w:asciiTheme="majorHAnsi" w:eastAsiaTheme="majorEastAsia" w:hAnsiTheme="majorHAnsi" w:cstheme="majorBidi"/>
       <w:i/>
       <w:iCs/>
-      <w:color w:val="000000"/>
-      <w:sz w:val="22"/>
+      <w:color w:val="404040" w:themeColor="text1" w:themeTint="BF"/>
     </w:rPr>
   </w:style>
   <w:style w:type="paragraph" w:styleId="Heading8">
@@ -4541,13 +697,13 @@
     <w:pPr>
       <w:keepNext/>
       <w:keepLines/>
-      <w:spacing w:before="200" w:after="120" w:line="252" w:lineRule="auto"/>
+      <w:spacing w:before="200" w:after="0"/>
       <w:outlineLvl w:val="7"/>
     </w:pPr>
     <w:rPr>
-      <w:rFonts w:asciiTheme="majorHAnsi" w:eastAsiaTheme="majorEastAsia" w:hAnsiTheme="majorHAnsi" w:cstheme="majorBidi" w:ascii="Arial" w:hAnsi="Arial"/>
-      <w:color w:val="000000"/>
-      <w:sz w:val="22"/>
+      <w:rFonts w:asciiTheme="majorHAnsi" w:eastAsiaTheme="majorEastAsia" w:hAnsiTheme="majorHAnsi" w:cstheme="majorBidi"/>
+      <w:color w:val="4F81BD" w:themeColor="accent1"/>
+      <w:sz w:val="20"/>
       <w:szCs w:val="20"/>
     </w:rPr>
   </w:style>
@@ -4564,15 +720,15 @@
     <w:pPr>
       <w:keepNext/>
       <w:keepLines/>
-      <w:spacing w:before="200" w:after="120" w:line="252" w:lineRule="auto"/>
+      <w:spacing w:before="200" w:after="0"/>
       <w:outlineLvl w:val="8"/>
     </w:pPr>
     <w:rPr>
-      <w:rFonts w:asciiTheme="majorHAnsi" w:eastAsiaTheme="majorEastAsia" w:hAnsiTheme="majorHAnsi" w:cstheme="majorBidi" w:ascii="Arial" w:hAnsi="Arial"/>
+      <w:rFonts w:asciiTheme="majorHAnsi" w:eastAsiaTheme="majorEastAsia" w:hAnsiTheme="majorHAnsi" w:cstheme="majorBidi"/>
       <w:i/>
       <w:iCs/>
-      <w:color w:val="000000"/>
-      <w:sz w:val="22"/>
+      <w:color w:val="404040" w:themeColor="text1" w:themeTint="BF"/>
+      <w:sz w:val="20"/>
       <w:szCs w:val="20"/>
     </w:rPr>
   </w:style>
@@ -4609,13 +765,8 @@
     <w:qFormat/>
     <w:rsid w:val="00FC693F"/>
     <w:pPr>
-      <w:spacing w:after="120" w:line="252" w:lineRule="auto"/>
-    </w:pPr>
-    <w:rPr>
-      <w:rFonts w:ascii="Arial" w:hAnsi="Arial"/>
-      <w:color w:val="000000"/>
-      <w:sz w:val="22"/>
-    </w:rPr>
+      <w:spacing w:after="0" w:line="240" w:lineRule="auto"/>
+    </w:pPr>
   </w:style>
   <w:style w:type="character" w:customStyle="1" w:styleId="Heading1Char">
     <w:name w:val="Heading 1 Char"/>
@@ -4669,18 +820,15 @@
     <w:qFormat/>
     <w:rsid w:val="00FC693F"/>
     <w:pPr>
-      <w:pBdr>
-        <w:bottom w:val="single" w:sz="8" w:space="4" w:color="4F81BD" w:themeColor="accent1"/>
-      </w:pBdr>
-      <w:spacing w:after="120" w:line="252" w:lineRule="auto"/>
+      <w:spacing w:after="160" w:line="240" w:lineRule="auto"/>
       <w:contextualSpacing/>
     </w:pPr>
     <w:rPr>
-      <w:rFonts w:asciiTheme="majorHAnsi" w:eastAsiaTheme="majorEastAsia" w:hAnsiTheme="majorHAnsi" w:cstheme="majorBidi" w:ascii="Arial" w:hAnsi="Arial"/>
+      <w:rFonts w:asciiTheme="majorHAnsi" w:eastAsiaTheme="majorEastAsia" w:hAnsiTheme="majorHAnsi" w:cstheme="majorBidi" w:ascii="Calibri" w:hAnsi="Calibri"/>
       <w:color w:val="000000"/>
       <w:spacing w:val="5"/>
       <w:kern w:val="28"/>
-      <w:sz w:val="46"/>
+      <w:sz w:val="38"/>
       <w:szCs w:val="52"/>
     </w:rPr>
   </w:style>
@@ -4711,15 +859,14 @@
       <w:numPr>
         <w:ilvl w:val="1"/>
       </w:numPr>
-      <w:spacing w:after="120" w:line="252" w:lineRule="auto"/>
     </w:pPr>
     <w:rPr>
-      <w:rFonts w:asciiTheme="majorHAnsi" w:eastAsiaTheme="majorEastAsia" w:hAnsiTheme="majorHAnsi" w:cstheme="majorBidi" w:ascii="Arial" w:hAnsi="Arial"/>
+      <w:rFonts w:asciiTheme="majorHAnsi" w:eastAsiaTheme="majorEastAsia" w:hAnsiTheme="majorHAnsi" w:cstheme="majorBidi"/>
       <w:i/>
       <w:iCs/>
-      <w:color w:val="000000"/>
+      <w:color w:val="4F81BD" w:themeColor="accent1"/>
       <w:spacing w:val="15"/>
-      <w:sz w:val="22"/>
+      <w:sz w:val="24"/>
       <w:szCs w:val="24"/>
     </w:rPr>
   </w:style>
@@ -4746,15 +893,9 @@
     <w:qFormat/>
     <w:rsid w:val="00FC693F"/>
     <w:pPr>
-      <w:spacing w:after="120" w:line="252" w:lineRule="auto"/>
       <w:ind w:left="720"/>
       <w:contextualSpacing/>
     </w:pPr>
-    <w:rPr>
-      <w:rFonts w:ascii="Arial" w:hAnsi="Arial"/>
-      <w:color w:val="000000"/>
-      <w:sz w:val="22"/>
-    </w:rPr>
   </w:style>
   <w:style w:type="paragraph" w:styleId="BodyText">
     <w:name w:val="Body Text"/>
@@ -4764,13 +905,8 @@
     <w:unhideWhenUsed/>
     <w:rsid w:val="00AA1D8D"/>
     <w:pPr>
-      <w:spacing w:after="120" w:line="252" w:lineRule="auto"/>
-    </w:pPr>
-    <w:rPr>
-      <w:rFonts w:ascii="Arial" w:hAnsi="Arial"/>
-      <w:color w:val="000000"/>
-      <w:sz w:val="22"/>
-    </w:rPr>
+      <w:spacing w:after="120"/>
+    </w:pPr>
   </w:style>
   <w:style w:type="character" w:customStyle="1" w:styleId="BodyTextChar">
     <w:name w:val="Body Text Char"/>
@@ -4787,13 +923,8 @@
     <w:unhideWhenUsed/>
     <w:rsid w:val="00AA1D8D"/>
     <w:pPr>
-      <w:spacing w:after="120" w:line="252" w:lineRule="auto"/>
-    </w:pPr>
-    <w:rPr>
-      <w:rFonts w:ascii="Arial" w:hAnsi="Arial"/>
-      <w:color w:val="000000"/>
-      <w:sz w:val="22"/>
-    </w:rPr>
+      <w:spacing w:after="120" w:line="480" w:lineRule="auto"/>
+    </w:pPr>
   </w:style>
   <w:style w:type="character" w:customStyle="1" w:styleId="BodyText2Char">
     <w:name w:val="Body Text 2 Char"/>
@@ -4810,12 +941,10 @@
     <w:unhideWhenUsed/>
     <w:rsid w:val="00AA1D8D"/>
     <w:pPr>
-      <w:spacing w:after="120" w:line="252" w:lineRule="auto"/>
+      <w:spacing w:after="120"/>
     </w:pPr>
     <w:rPr>
-      <w:rFonts w:ascii="Arial" w:hAnsi="Arial"/>
-      <w:color w:val="000000"/>
-      <w:sz w:val="22"/>
+      <w:sz w:val="16"/>
       <w:szCs w:val="16"/>
     </w:rPr>
   </w:style>
@@ -4837,15 +966,9 @@
     <w:unhideWhenUsed/>
     <w:rsid w:val="00AA1D8D"/>
     <w:pPr>
-      <w:spacing w:after="120" w:line="252" w:lineRule="auto"/>
       <w:ind w:left="360" w:hanging="360"/>
       <w:contextualSpacing/>
     </w:pPr>
-    <w:rPr>
-      <w:rFonts w:ascii="Arial" w:hAnsi="Arial"/>
-      <w:color w:val="000000"/>
-      <w:sz w:val="22"/>
-    </w:rPr>
   </w:style>
   <w:style w:type="paragraph" w:styleId="List2">
     <w:name w:val="List 2"/>
@@ -4854,15 +977,9 @@
     <w:unhideWhenUsed/>
     <w:rsid w:val="00326F90"/>
     <w:pPr>
-      <w:spacing w:after="120" w:line="252" w:lineRule="auto"/>
       <w:ind w:left="720" w:hanging="360"/>
       <w:contextualSpacing/>
     </w:pPr>
-    <w:rPr>
-      <w:rFonts w:ascii="Arial" w:hAnsi="Arial"/>
-      <w:color w:val="000000"/>
-      <w:sz w:val="22"/>
-    </w:rPr>
   </w:style>
   <w:style w:type="paragraph" w:styleId="List3">
     <w:name w:val="List 3"/>
@@ -4871,15 +988,9 @@
     <w:unhideWhenUsed/>
     <w:rsid w:val="00326F90"/>
     <w:pPr>
-      <w:spacing w:after="120" w:line="252" w:lineRule="auto"/>
       <w:ind w:left="1080" w:hanging="360"/>
       <w:contextualSpacing/>
     </w:pPr>
-    <w:rPr>
-      <w:rFonts w:ascii="Arial" w:hAnsi="Arial"/>
-      <w:color w:val="000000"/>
-      <w:sz w:val="22"/>
-    </w:rPr>
   </w:style>
   <w:style w:type="paragraph" w:styleId="ListBullet">
     <w:name w:val="List Bullet"/>
@@ -4891,14 +1002,8 @@
       <w:numPr>
         <w:numId w:val="1"/>
       </w:numPr>
-      <w:spacing w:after="120" w:line="252" w:lineRule="auto"/>
       <w:contextualSpacing/>
     </w:pPr>
-    <w:rPr>
-      <w:rFonts w:ascii="Arial" w:hAnsi="Arial"/>
-      <w:color w:val="000000"/>
-      <w:sz w:val="22"/>
-    </w:rPr>
   </w:style>
   <w:style w:type="paragraph" w:styleId="ListBullet2">
     <w:name w:val="List Bullet 2"/>
@@ -4910,14 +1015,8 @@
       <w:numPr>
         <w:numId w:val="2"/>
       </w:numPr>
-      <w:spacing w:after="120" w:line="252" w:lineRule="auto"/>
       <w:contextualSpacing/>
     </w:pPr>
-    <w:rPr>
-      <w:rFonts w:ascii="Arial" w:hAnsi="Arial"/>
-      <w:color w:val="000000"/>
-      <w:sz w:val="22"/>
-    </w:rPr>
   </w:style>
   <w:style w:type="paragraph" w:styleId="ListBullet3">
     <w:name w:val="List Bullet 3"/>
@@ -4929,14 +1028,8 @@
       <w:numPr>
         <w:numId w:val="3"/>
       </w:numPr>
-      <w:spacing w:after="120" w:line="252" w:lineRule="auto"/>
       <w:contextualSpacing/>
     </w:pPr>
-    <w:rPr>
-      <w:rFonts w:ascii="Arial" w:hAnsi="Arial"/>
-      <w:color w:val="000000"/>
-      <w:sz w:val="22"/>
-    </w:rPr>
   </w:style>
   <w:style w:type="paragraph" w:styleId="ListNumber">
     <w:name w:val="List Number"/>
@@ -4948,14 +1041,8 @@
       <w:numPr>
         <w:numId w:val="5"/>
       </w:numPr>
-      <w:spacing w:after="120" w:line="252" w:lineRule="auto"/>
       <w:contextualSpacing/>
     </w:pPr>
-    <w:rPr>
-      <w:rFonts w:ascii="Arial" w:hAnsi="Arial"/>
-      <w:color w:val="000000"/>
-      <w:sz w:val="22"/>
-    </w:rPr>
   </w:style>
   <w:style w:type="paragraph" w:styleId="ListNumber2">
     <w:name w:val="List Number 2"/>
@@ -4967,14 +1054,8 @@
       <w:numPr>
         <w:numId w:val="6"/>
       </w:numPr>
-      <w:spacing w:after="120" w:line="252" w:lineRule="auto"/>
       <w:contextualSpacing/>
     </w:pPr>
-    <w:rPr>
-      <w:rFonts w:ascii="Arial" w:hAnsi="Arial"/>
-      <w:color w:val="000000"/>
-      <w:sz w:val="22"/>
-    </w:rPr>
   </w:style>
   <w:style w:type="paragraph" w:styleId="ListNumber3">
     <w:name w:val="List Number 3"/>
@@ -4986,14 +1067,8 @@
       <w:numPr>
         <w:numId w:val="7"/>
       </w:numPr>
-      <w:spacing w:after="120" w:line="252" w:lineRule="auto"/>
       <w:contextualSpacing/>
     </w:pPr>
-    <w:rPr>
-      <w:rFonts w:ascii="Arial" w:hAnsi="Arial"/>
-      <w:color w:val="000000"/>
-      <w:sz w:val="22"/>
-    </w:rPr>
   </w:style>
   <w:style w:type="paragraph" w:styleId="ListContinue">
     <w:name w:val="List Continue"/>
@@ -5002,15 +1077,10 @@
     <w:unhideWhenUsed/>
     <w:rsid w:val="0029639D"/>
     <w:pPr>
-      <w:spacing w:after="120" w:line="252" w:lineRule="auto"/>
+      <w:spacing w:after="120"/>
       <w:ind w:left="360"/>
       <w:contextualSpacing/>
     </w:pPr>
-    <w:rPr>
-      <w:rFonts w:ascii="Arial" w:hAnsi="Arial"/>
-      <w:color w:val="000000"/>
-      <w:sz w:val="22"/>
-    </w:rPr>
   </w:style>
   <w:style w:type="paragraph" w:styleId="ListContinue2">
     <w:name w:val="List Continue 2"/>
@@ -5019,15 +1089,10 @@
     <w:unhideWhenUsed/>
     <w:rsid w:val="0029639D"/>
     <w:pPr>
-      <w:spacing w:after="120" w:line="252" w:lineRule="auto"/>
+      <w:spacing w:after="120"/>
       <w:ind w:left="720"/>
       <w:contextualSpacing/>
     </w:pPr>
-    <w:rPr>
-      <w:rFonts w:ascii="Arial" w:hAnsi="Arial"/>
-      <w:color w:val="000000"/>
-      <w:sz w:val="22"/>
-    </w:rPr>
   </w:style>
   <w:style w:type="paragraph" w:styleId="ListContinue3">
     <w:name w:val="List Continue 3"/>
@@ -5036,15 +1101,10 @@
     <w:unhideWhenUsed/>
     <w:rsid w:val="0029639D"/>
     <w:pPr>
-      <w:spacing w:after="120" w:line="252" w:lineRule="auto"/>
+      <w:spacing w:after="120"/>
       <w:ind w:left="1080"/>
       <w:contextualSpacing/>
     </w:pPr>
-    <w:rPr>
-      <w:rFonts w:ascii="Arial" w:hAnsi="Arial"/>
-      <w:color w:val="000000"/>
-      <w:sz w:val="22"/>
-    </w:rPr>
   </w:style>
   <w:style w:type="paragraph" w:styleId="MacroText">
     <w:name w:val="macro"/>
@@ -5062,12 +1122,10 @@
         <w:tab w:val="left" w:pos="3456"/>
         <w:tab w:val="left" w:pos="4032"/>
       </w:tabs>
-      <w:spacing w:after="120" w:line="252" w:lineRule="auto"/>
     </w:pPr>
     <w:rPr>
-      <w:rFonts w:ascii="Arial" w:hAnsi="Arial"/>
-      <w:color w:val="000000"/>
-      <w:sz w:val="22"/>
+      <w:rFonts w:ascii="Courier" w:hAnsi="Courier"/>
+      <w:sz w:val="20"/>
       <w:szCs w:val="20"/>
     </w:rPr>
   </w:style>
@@ -5091,15 +1149,10 @@
     <w:uiPriority w:val="29"/>
     <w:qFormat/>
     <w:rsid w:val="00FC693F"/>
-    <w:pPr>
-      <w:spacing w:after="120" w:line="252" w:lineRule="auto"/>
-    </w:pPr>
     <w:rPr>
-      <w:rFonts w:ascii="Arial" w:hAnsi="Arial"/>
       <w:i/>
       <w:iCs/>
-      <w:color w:val="000000"/>
-      <w:sz w:val="22"/>
+      <w:color w:val="000000" w:themeColor="text1"/>
     </w:rPr>
   </w:style>
   <w:style w:type="character" w:customStyle="1" w:styleId="QuoteChar">
@@ -5210,14 +1263,13 @@
     <w:qFormat/>
     <w:rsid w:val="00FC693F"/>
     <w:pPr>
-      <w:spacing w:line="252" w:lineRule="auto" w:after="120"/>
+      <w:spacing w:line="240" w:lineRule="auto"/>
     </w:pPr>
     <w:rPr>
-      <w:rFonts w:ascii="Arial" w:hAnsi="Arial"/>
       <w:b/>
       <w:bCs/>
-      <w:color w:val="000000"/>
-      <w:sz w:val="22"/>
+      <w:color w:val="4F81BD" w:themeColor="accent1"/>
+      <w:sz w:val="18"/>
       <w:szCs w:val="18"/>
     </w:rPr>
   </w:style>
@@ -5252,20 +1304,15 @@
     <w:qFormat/>
     <w:rsid w:val="00FC693F"/>
     <w:pPr>
-      <w:pBdr>
-        <w:bottom w:val="single" w:sz="4" w:space="4" w:color="4F81BD" w:themeColor="accent1"/>
-      </w:pBdr>
-      <w:spacing w:before="200" w:after="120" w:line="252" w:lineRule="auto"/>
+      <w:spacing w:before="200" w:after="280"/>
       <w:ind w:left="936" w:right="936"/>
     </w:pPr>
     <w:rPr>
-      <w:rFonts w:ascii="Arial" w:hAnsi="Arial"/>
       <w:b/>
       <w:bCs/>
       <w:i/>
       <w:iCs/>
-      <w:color w:val="000000"/>
-      <w:sz w:val="22"/>
+      <w:color w:val="4F81BD" w:themeColor="accent1"/>
     </w:rPr>
   </w:style>
   <w:style w:type="character" w:customStyle="1" w:styleId="IntenseQuoteChar">
@@ -5358,14 +1405,8 @@
     <w:qFormat/>
     <w:rsid w:val="00FC693F"/>
     <w:pPr>
-      <w:spacing w:after="120" w:line="252" w:lineRule="auto"/>
       <w:outlineLvl w:val="9"/>
     </w:pPr>
-    <w:rPr>
-      <w:rFonts w:ascii="Arial" w:hAnsi="Arial"/>
-      <w:color w:val="000000"/>
-      <w:sz w:val="22"/>
-    </w:rPr>
   </w:style>
   <w:style w:type="table" w:styleId="TableGrid">
     <w:name w:val="Table Grid"/>

</xml_diff>